<commit_message>
Correct course-evidence record and rebuild the report (Phase 2 draft)
- Evidence table: apply the independent row-by-row verification fixes,
  state the UTC/VM-local date convention, and stop using the images that
  carry AI-generation (C2PA) metadata (1.1 IMG005/IMG006, 1.4 IMG056) as
  evidence; the model-scale argument now rests on the watermarked course
  frames IMG057-IMG059 (3.5 cm, 8 cm, 8.2 cm)
- Audit 3.1 and report 8.2 updated accordingly
- Report: footer tab fix, IEEE citation ranges, gz-classic reference,
  table widths, short tables kept on one page, hanging indent for wrapped
  code lines, compact TF-tree figure; 25 pages, validated

Co-Authored-By: Claude Opus 5.5 <noreply@anthropic.com>
Claude-Session: https://claude.ai/code/session_01HT8zHL81wrYxCu5VbARJow
</commit_message>
<xml_diff>
--- a/ros2_manipulator_assignment/report/Robot_Operating_System_2_Manipulator_Report.docx
+++ b/ros2_manipulator_assignment/report/Robot_Operating_System_2_Manipulator_Report.docx
@@ -617,7 +617,7 @@
           <w:tab/>
         </w:r>
         <w:r>
-          <w:t xml:space="preserve">10</w:t>
+          <w:t xml:space="preserve">11</w:t>
         </w:r>
       </w:hyperlink>
     </w:p>
@@ -636,7 +636,7 @@
           <w:tab/>
         </w:r>
         <w:r>
-          <w:t xml:space="preserve">11</w:t>
+          <w:t xml:space="preserve">12</w:t>
         </w:r>
       </w:hyperlink>
     </w:p>
@@ -655,7 +655,7 @@
           <w:tab/>
         </w:r>
         <w:r>
-          <w:t xml:space="preserve">11</w:t>
+          <w:t xml:space="preserve">12</w:t>
         </w:r>
       </w:hyperlink>
     </w:p>
@@ -731,7 +731,7 @@
           <w:tab/>
         </w:r>
         <w:r>
-          <w:t xml:space="preserve">15</w:t>
+          <w:t xml:space="preserve">16</w:t>
         </w:r>
       </w:hyperlink>
     </w:p>
@@ -807,7 +807,7 @@
           <w:tab/>
         </w:r>
         <w:r>
-          <w:t xml:space="preserve">18</w:t>
+          <w:t xml:space="preserve">19</w:t>
         </w:r>
       </w:hyperlink>
     </w:p>
@@ -902,7 +902,7 @@
           <w:tab/>
         </w:r>
         <w:r>
-          <w:t xml:space="preserve">20</w:t>
+          <w:t xml:space="preserve">21</w:t>
         </w:r>
       </w:hyperlink>
     </w:p>
@@ -959,7 +959,7 @@
           <w:tab/>
         </w:r>
         <w:r>
-          <w:t xml:space="preserve">22</w:t>
+          <w:t xml:space="preserve">23</w:t>
         </w:r>
       </w:hyperlink>
     </w:p>
@@ -978,7 +978,7 @@
           <w:tab/>
         </w:r>
         <w:r>
-          <w:t xml:space="preserve">22</w:t>
+          <w:t xml:space="preserve">23</w:t>
         </w:r>
       </w:hyperlink>
     </w:p>
@@ -1139,7 +1139,7 @@
         <w:t>Category A – documented student work</w:t>
       </w:r>
       <w:r>
-        <w:t xml:space="preserve"> is work or study supported by a located piece of evidence in the student's notes [1], [2], [3], [4], [5]. </w:t>
+        <w:t xml:space="preserve"> is work or study supported by a located piece of evidence in the student's notes [1]–[5]. </w:t>
       </w:r>
       <w:r>
         <w:rPr>
@@ -1838,7 +1838,7 @@
       <w:r>
         <w:drawing>
           <wp:inline xmlns:a="http://schemas.openxmlformats.org/drawingml/2006/main" xmlns:pic="http://schemas.openxmlformats.org/drawingml/2006/picture">
-            <wp:extent cx="5040000" cy="3469620"/>
+            <wp:extent cx="5040000" cy="3459005"/>
             <wp:docPr id="1" name="Picture 1"/>
             <wp:cNvGraphicFramePr>
               <a:graphicFrameLocks noChangeAspect="1"/>
@@ -1859,7 +1859,7 @@
                   <pic:spPr>
                     <a:xfrm>
                       <a:off x="0" y="0"/>
-                      <a:ext cx="5040000" cy="3469620"/>
+                      <a:ext cx="5040000" cy="3459005"/>
                     </a:xfrm>
                     <a:prstGeom prst="rect"/>
                   </pic:spPr>
@@ -1948,7 +1948,7 @@
         <w:jc w:val="both"/>
       </w:pPr>
       <w:r>
-        <w:t xml:space="preserve">Nodes interact through three interface styles: topics for continuous data streams, services for short request/response calls and actions for long-running goals with feedback [24], [25], [26]. Their data types are defined in an interface definition language (.msg, .srv and .action files) from which code is generated for each language [27]; this is why a C++ node and a Python node can exchange a </w:t>
+        <w:t xml:space="preserve">Nodes interact through three interface styles: topics for continuous data streams, services for short request/response calls and actions for long-running goals with feedback [24]–[26]. Their data types are defined in an interface definition language (.msg, .srv and .action files) from which code is generated for each language [27]; this is why a C++ node and a Python node can exchange a </w:t>
       </w:r>
       <w:r>
         <w:rPr>
@@ -3365,7 +3365,7 @@
       <w:r>
         <w:drawing>
           <wp:inline xmlns:a="http://schemas.openxmlformats.org/drawingml/2006/main" xmlns:pic="http://schemas.openxmlformats.org/drawingml/2006/picture">
-            <wp:extent cx="5760000" cy="1608009"/>
+            <wp:extent cx="5040000" cy="2666859"/>
             <wp:docPr id="2" name="Picture 2"/>
             <wp:cNvGraphicFramePr>
               <a:graphicFrameLocks noChangeAspect="1"/>
@@ -3386,7 +3386,7 @@
                   <pic:spPr>
                     <a:xfrm>
                       <a:off x="0" y="0"/>
-                      <a:ext cx="5760000" cy="1608009"/>
+                      <a:ext cx="5040000" cy="2666859"/>
                     </a:xfrm>
                     <a:prstGeom prst="rect"/>
                   </pic:spPr>
@@ -4277,10 +4277,9 @@
         <w:tblLook w:firstColumn="1" w:firstRow="1" w:lastColumn="0" w:lastRow="0" w:noHBand="0" w:noVBand="1" w:val="04A0"/>
       </w:tblPr>
       <w:tblGrid>
-        <w:gridCol w:w="1814"/>
-        <w:gridCol w:w="2211"/>
-        <w:gridCol w:w="2211"/>
-        <w:gridCol w:w="2834"/>
+        <w:gridCol w:w="1530"/>
+        <w:gridCol w:w="3174"/>
+        <w:gridCol w:w="4365"/>
       </w:tblGrid>
       <w:tr>
         <w:trPr>
@@ -4289,8 +4288,161 @@
         </w:trPr>
         <w:tc>
           <w:tcPr>
-            <w:tcW w:type="dxa" w:w="1814"/>
+            <w:tcW w:type="dxa" w:w="1531"/>
             <w:shd w:val="clear" w:color="auto" w:fill="DCE6F0"/>
+            <w:tcMar>
+              <w:top w:w="40" w:type="dxa"/>
+              <w:left w:w="80" w:type="dxa"/>
+              <w:bottom w:w="40" w:type="dxa"/>
+              <w:right w:w="80" w:type="dxa"/>
+            </w:tcMar>
+          </w:tcPr>
+          <w:p>
+            <w:pPr>
+              <w:pStyle w:val="TableText"/>
+              <w:keepNext/>
+            </w:pPr>
+            <w:r>
+              <w:rPr>
+                <w:b/>
+                <w:sz w:val="18"/>
+              </w:rPr>
+              <w:t>Direction</w:t>
+            </w:r>
+          </w:p>
+        </w:tc>
+        <w:tc>
+          <w:tcPr>
+            <w:tcW w:type="dxa" w:w="3175"/>
+            <w:shd w:val="clear" w:color="auto" w:fill="DCE6F0"/>
+            <w:tcMar>
+              <w:top w:w="40" w:type="dxa"/>
+              <w:left w:w="80" w:type="dxa"/>
+              <w:bottom w:w="40" w:type="dxa"/>
+              <w:right w:w="80" w:type="dxa"/>
+            </w:tcMar>
+          </w:tcPr>
+          <w:p>
+            <w:pPr>
+              <w:pStyle w:val="TableText"/>
+              <w:keepNext/>
+            </w:pPr>
+            <w:r>
+              <w:rPr>
+                <w:b/>
+                <w:sz w:val="18"/>
+              </w:rPr>
+              <w:t>Publisher → subscriber (package / executable)</w:t>
+            </w:r>
+          </w:p>
+        </w:tc>
+        <w:tc>
+          <w:tcPr>
+            <w:tcW w:type="dxa" w:w="4365"/>
+            <w:shd w:val="clear" w:color="auto" w:fill="DCE6F0"/>
+            <w:tcMar>
+              <w:top w:w="40" w:type="dxa"/>
+              <w:left w:w="80" w:type="dxa"/>
+              <w:bottom w:w="40" w:type="dxa"/>
+              <w:right w:w="80" w:type="dxa"/>
+            </w:tcMar>
+          </w:tcPr>
+          <w:p>
+            <w:pPr>
+              <w:pStyle w:val="TableText"/>
+              <w:keepNext/>
+            </w:pPr>
+            <w:r>
+              <w:rPr>
+                <w:b/>
+                <w:sz w:val="18"/>
+              </w:rPr>
+              <w:t>Result in the test container</w:t>
+            </w:r>
+          </w:p>
+        </w:tc>
+      </w:tr>
+      <w:tr>
+        <w:trPr>
+          <w:cantSplit/>
+        </w:trPr>
+        <w:tc>
+          <w:tcPr>
+            <w:tcW w:type="dxa" w:w="1531"/>
+            <w:tcMar>
+              <w:top w:w="40" w:type="dxa"/>
+              <w:left w:w="80" w:type="dxa"/>
+              <w:bottom w:w="40" w:type="dxa"/>
+              <w:right w:w="80" w:type="dxa"/>
+            </w:tcMar>
+          </w:tcPr>
+          <w:p>
+            <w:pPr>
+              <w:pStyle w:val="TableText"/>
+              <w:keepNext/>
+            </w:pPr>
+            <w:r>
+              <w:rPr>
+                <w:sz w:val="18"/>
+              </w:rPr>
+              <w:t>(a) Python → C++</w:t>
+            </w:r>
+          </w:p>
+        </w:tc>
+        <w:tc>
+          <w:tcPr>
+            <w:tcW w:type="dxa" w:w="3175"/>
+            <w:tcMar>
+              <w:top w:w="40" w:type="dxa"/>
+              <w:left w:w="80" w:type="dxa"/>
+              <w:bottom w:w="40" w:type="dxa"/>
+              <w:right w:w="80" w:type="dxa"/>
+            </w:tcMar>
+          </w:tcPr>
+          <w:p>
+            <w:pPr>
+              <w:pStyle w:val="TableText"/>
+              <w:keepNext/>
+            </w:pPr>
+            <w:r>
+              <w:rPr>
+                <w:sz w:val="18"/>
+              </w:rPr>
+              <w:t>arduinobot_py_examples / simple_publisher → arduinobot_cpp_examples / simple_subscriber</w:t>
+            </w:r>
+          </w:p>
+        </w:tc>
+        <w:tc>
+          <w:tcPr>
+            <w:tcW w:type="dxa" w:w="4365"/>
+            <w:tcMar>
+              <w:top w:w="40" w:type="dxa"/>
+              <w:left w:w="80" w:type="dxa"/>
+              <w:bottom w:w="40" w:type="dxa"/>
+              <w:right w:w="80" w:type="dxa"/>
+            </w:tcMar>
+          </w:tcPr>
+          <w:p>
+            <w:pPr>
+              <w:pStyle w:val="TableText"/>
+              <w:keepNext/>
+            </w:pPr>
+            <w:r>
+              <w:rPr>
+                <w:sz w:val="18"/>
+              </w:rPr>
+              <w:t>33 consecutive messages received (counter 0–32, "I heard: Hello ROS 2 - counter: 0" …); average rate 1.000 Hz; no traceback on Ctrl+C</w:t>
+            </w:r>
+          </w:p>
+        </w:tc>
+      </w:tr>
+      <w:tr>
+        <w:trPr>
+          <w:cantSplit/>
+        </w:trPr>
+        <w:tc>
+          <w:tcPr>
+            <w:tcW w:type="dxa" w:w="1531"/>
             <w:tcMar>
               <w:top w:w="40" w:type="dxa"/>
               <w:left w:w="80" w:type="dxa"/>
@@ -4304,17 +4456,15 @@
             </w:pPr>
             <w:r>
               <w:rPr>
-                <w:b/>
-                <w:sz w:val="19"/>
+                <w:sz w:val="18"/>
               </w:rPr>
-              <w:t>Scenario (test container)</w:t>
+              <w:t>(b) C++ → Python</w:t>
             </w:r>
           </w:p>
         </w:tc>
         <w:tc>
           <w:tcPr>
-            <w:tcW w:type="dxa" w:w="2211"/>
-            <w:shd w:val="clear" w:color="auto" w:fill="DCE6F0"/>
+            <w:tcW w:type="dxa" w:w="3175"/>
             <w:tcMar>
               <w:top w:w="40" w:type="dxa"/>
               <w:left w:w="80" w:type="dxa"/>
@@ -4328,17 +4478,15 @@
             </w:pPr>
             <w:r>
               <w:rPr>
-                <w:b/>
-                <w:sz w:val="19"/>
+                <w:sz w:val="18"/>
               </w:rPr>
-              <w:t>Publisher</w:t>
+              <w:t>arduinobot_cpp_examples / simple_publisher → arduinobot_py_examples / simple_subscriber</w:t>
             </w:r>
           </w:p>
         </w:tc>
         <w:tc>
           <w:tcPr>
-            <w:tcW w:type="dxa" w:w="2211"/>
-            <w:shd w:val="clear" w:color="auto" w:fill="DCE6F0"/>
+            <w:tcW w:type="dxa" w:w="4365"/>
             <w:tcMar>
               <w:top w:w="40" w:type="dxa"/>
               <w:left w:w="80" w:type="dxa"/>
@@ -4352,218 +4500,7 @@
             </w:pPr>
             <w:r>
               <w:rPr>
-                <w:b/>
-                <w:sz w:val="19"/>
-              </w:rPr>
-              <w:t>Subscriber</w:t>
-            </w:r>
-          </w:p>
-        </w:tc>
-        <w:tc>
-          <w:tcPr>
-            <w:tcW w:type="dxa" w:w="2835"/>
-            <w:shd w:val="clear" w:color="auto" w:fill="DCE6F0"/>
-            <w:tcMar>
-              <w:top w:w="40" w:type="dxa"/>
-              <w:left w:w="80" w:type="dxa"/>
-              <w:bottom w:w="40" w:type="dxa"/>
-              <w:right w:w="80" w:type="dxa"/>
-            </w:tcMar>
-          </w:tcPr>
-          <w:p>
-            <w:pPr>
-              <w:pStyle w:val="TableText"/>
-            </w:pPr>
-            <w:r>
-              <w:rPr>
-                <w:b/>
-                <w:sz w:val="19"/>
-              </w:rPr>
-              <w:t>Result</w:t>
-            </w:r>
-          </w:p>
-        </w:tc>
-      </w:tr>
-      <w:tr>
-        <w:trPr>
-          <w:cantSplit/>
-        </w:trPr>
-        <w:tc>
-          <w:tcPr>
-            <w:tcW w:type="dxa" w:w="1814"/>
-            <w:tcMar>
-              <w:top w:w="40" w:type="dxa"/>
-              <w:left w:w="80" w:type="dxa"/>
-              <w:bottom w:w="40" w:type="dxa"/>
-              <w:right w:w="80" w:type="dxa"/>
-            </w:tcMar>
-          </w:tcPr>
-          <w:p>
-            <w:pPr>
-              <w:pStyle w:val="TableText"/>
-            </w:pPr>
-            <w:r>
-              <w:rPr>
-                <w:sz w:val="19"/>
-              </w:rPr>
-              <w:t>(a) Python → C++</w:t>
-            </w:r>
-          </w:p>
-        </w:tc>
-        <w:tc>
-          <w:tcPr>
-            <w:tcW w:type="dxa" w:w="2211"/>
-            <w:tcMar>
-              <w:top w:w="40" w:type="dxa"/>
-              <w:left w:w="80" w:type="dxa"/>
-              <w:bottom w:w="40" w:type="dxa"/>
-              <w:right w:w="80" w:type="dxa"/>
-            </w:tcMar>
-          </w:tcPr>
-          <w:p>
-            <w:pPr>
-              <w:pStyle w:val="TableText"/>
-            </w:pPr>
-            <w:r>
-              <w:rPr>
-                <w:sz w:val="19"/>
-              </w:rPr>
-              <w:t>arduinobot_py_examples simple_publisher</w:t>
-            </w:r>
-          </w:p>
-        </w:tc>
-        <w:tc>
-          <w:tcPr>
-            <w:tcW w:type="dxa" w:w="2211"/>
-            <w:tcMar>
-              <w:top w:w="40" w:type="dxa"/>
-              <w:left w:w="80" w:type="dxa"/>
-              <w:bottom w:w="40" w:type="dxa"/>
-              <w:right w:w="80" w:type="dxa"/>
-            </w:tcMar>
-          </w:tcPr>
-          <w:p>
-            <w:pPr>
-              <w:pStyle w:val="TableText"/>
-            </w:pPr>
-            <w:r>
-              <w:rPr>
-                <w:sz w:val="19"/>
-              </w:rPr>
-              <w:t>arduinobot_cpp_examples simple_subscriber</w:t>
-            </w:r>
-          </w:p>
-        </w:tc>
-        <w:tc>
-          <w:tcPr>
-            <w:tcW w:type="dxa" w:w="2835"/>
-            <w:tcMar>
-              <w:top w:w="40" w:type="dxa"/>
-              <w:left w:w="80" w:type="dxa"/>
-              <w:bottom w:w="40" w:type="dxa"/>
-              <w:right w:w="80" w:type="dxa"/>
-            </w:tcMar>
-          </w:tcPr>
-          <w:p>
-            <w:pPr>
-              <w:pStyle w:val="TableText"/>
-            </w:pPr>
-            <w:r>
-              <w:rPr>
-                <w:sz w:val="19"/>
-              </w:rPr>
-              <w:t>33 consecutive messages received (counter 0–32, "I heard: Hello ROS 2 - counter: 0" …); average rate 1.000 Hz; no traceback on Ctrl+C</w:t>
-            </w:r>
-          </w:p>
-        </w:tc>
-      </w:tr>
-      <w:tr>
-        <w:trPr>
-          <w:cantSplit/>
-        </w:trPr>
-        <w:tc>
-          <w:tcPr>
-            <w:tcW w:type="dxa" w:w="1814"/>
-            <w:tcMar>
-              <w:top w:w="40" w:type="dxa"/>
-              <w:left w:w="80" w:type="dxa"/>
-              <w:bottom w:w="40" w:type="dxa"/>
-              <w:right w:w="80" w:type="dxa"/>
-            </w:tcMar>
-          </w:tcPr>
-          <w:p>
-            <w:pPr>
-              <w:pStyle w:val="TableText"/>
-            </w:pPr>
-            <w:r>
-              <w:rPr>
-                <w:sz w:val="19"/>
-              </w:rPr>
-              <w:t>(b) C++ → Python</w:t>
-            </w:r>
-          </w:p>
-        </w:tc>
-        <w:tc>
-          <w:tcPr>
-            <w:tcW w:type="dxa" w:w="2211"/>
-            <w:tcMar>
-              <w:top w:w="40" w:type="dxa"/>
-              <w:left w:w="80" w:type="dxa"/>
-              <w:bottom w:w="40" w:type="dxa"/>
-              <w:right w:w="80" w:type="dxa"/>
-            </w:tcMar>
-          </w:tcPr>
-          <w:p>
-            <w:pPr>
-              <w:pStyle w:val="TableText"/>
-            </w:pPr>
-            <w:r>
-              <w:rPr>
-                <w:sz w:val="19"/>
-              </w:rPr>
-              <w:t>arduinobot_cpp_examples simple_publisher</w:t>
-            </w:r>
-          </w:p>
-        </w:tc>
-        <w:tc>
-          <w:tcPr>
-            <w:tcW w:type="dxa" w:w="2211"/>
-            <w:tcMar>
-              <w:top w:w="40" w:type="dxa"/>
-              <w:left w:w="80" w:type="dxa"/>
-              <w:bottom w:w="40" w:type="dxa"/>
-              <w:right w:w="80" w:type="dxa"/>
-            </w:tcMar>
-          </w:tcPr>
-          <w:p>
-            <w:pPr>
-              <w:pStyle w:val="TableText"/>
-            </w:pPr>
-            <w:r>
-              <w:rPr>
-                <w:sz w:val="19"/>
-              </w:rPr>
-              <w:t>arduinobot_py_examples simple_subscriber</w:t>
-            </w:r>
-          </w:p>
-        </w:tc>
-        <w:tc>
-          <w:tcPr>
-            <w:tcW w:type="dxa" w:w="2835"/>
-            <w:tcMar>
-              <w:top w:w="40" w:type="dxa"/>
-              <w:left w:w="80" w:type="dxa"/>
-              <w:bottom w:w="40" w:type="dxa"/>
-              <w:right w:w="80" w:type="dxa"/>
-            </w:tcMar>
-          </w:tcPr>
-          <w:p>
-            <w:pPr>
-              <w:pStyle w:val="TableText"/>
-            </w:pPr>
-            <w:r>
-              <w:rPr>
-                <w:sz w:val="19"/>
+                <w:sz w:val="18"/>
               </w:rPr>
               <w:t>33 consecutive messages received (counter 0–32, "I heard: Hello ROS 2 - counter:0" …); average rate 1.000 Hz; no traceback on Ctrl+C</w:t>
             </w:r>
@@ -4685,7 +4622,7 @@
         <w:t>overlay</w:t>
       </w:r>
       <w:r>
-        <w:t xml:space="preserve">, whose packages take precedence over those of the underlay [31], [30]. Sourcing </w:t>
+        <w:t xml:space="preserve">, whose packages take precedence over those of the underlay [30], [31]. Sourcing </w:t>
       </w:r>
       <w:r>
         <w:rPr>
@@ -4765,7 +4702,7 @@
       <w:r>
         <w:drawing>
           <wp:inline xmlns:a="http://schemas.openxmlformats.org/drawingml/2006/main" xmlns:pic="http://schemas.openxmlformats.org/drawingml/2006/picture">
-            <wp:extent cx="4500000" cy="2765720"/>
+            <wp:extent cx="4500000" cy="3293566"/>
             <wp:docPr id="3" name="Picture 3"/>
             <wp:cNvGraphicFramePr>
               <a:graphicFrameLocks noChangeAspect="1"/>
@@ -4786,7 +4723,7 @@
                   <pic:spPr>
                     <a:xfrm>
                       <a:off x="0" y="0"/>
-                      <a:ext cx="4500000" cy="2765720"/>
+                      <a:ext cx="4500000" cy="3293566"/>
                     </a:xfrm>
                     <a:prstGeom prst="rect"/>
                   </pic:spPr>
@@ -5111,10 +5048,10 @@
         <w:tblLook w:firstColumn="1" w:firstRow="1" w:lastColumn="0" w:lastRow="0" w:noHBand="0" w:noVBand="1" w:val="04A0"/>
       </w:tblPr>
       <w:tblGrid>
-        <w:gridCol w:w="2040"/>
-        <w:gridCol w:w="1303"/>
-        <w:gridCol w:w="4025"/>
-        <w:gridCol w:w="1700"/>
+        <w:gridCol w:w="2154"/>
+        <w:gridCol w:w="1360"/>
+        <w:gridCol w:w="3911"/>
+        <w:gridCol w:w="1644"/>
       </w:tblGrid>
       <w:tr>
         <w:trPr>
@@ -5123,7 +5060,7 @@
         </w:trPr>
         <w:tc>
           <w:tcPr>
-            <w:tcW w:type="dxa" w:w="2041"/>
+            <w:tcW w:type="dxa" w:w="2154"/>
             <w:shd w:val="clear" w:color="auto" w:fill="DCE6F0"/>
             <w:tcMar>
               <w:top w:w="40" w:type="dxa"/>
@@ -5135,6 +5072,7 @@
           <w:p>
             <w:pPr>
               <w:pStyle w:val="TableText"/>
+              <w:keepNext/>
             </w:pPr>
             <w:r>
               <w:rPr>
@@ -5147,7 +5085,7 @@
         </w:tc>
         <w:tc>
           <w:tcPr>
-            <w:tcW w:type="dxa" w:w="1304"/>
+            <w:tcW w:type="dxa" w:w="1361"/>
             <w:shd w:val="clear" w:color="auto" w:fill="DCE6F0"/>
             <w:tcMar>
               <w:top w:w="40" w:type="dxa"/>
@@ -5159,6 +5097,7 @@
           <w:p>
             <w:pPr>
               <w:pStyle w:val="TableText"/>
+              <w:keepNext/>
             </w:pPr>
             <w:r>
               <w:rPr>
@@ -5171,7 +5110,7 @@
         </w:tc>
         <w:tc>
           <w:tcPr>
-            <w:tcW w:type="dxa" w:w="4025"/>
+            <w:tcW w:type="dxa" w:w="3912"/>
             <w:shd w:val="clear" w:color="auto" w:fill="DCE6F0"/>
             <w:tcMar>
               <w:top w:w="40" w:type="dxa"/>
@@ -5183,6 +5122,7 @@
           <w:p>
             <w:pPr>
               <w:pStyle w:val="TableText"/>
+              <w:keepNext/>
             </w:pPr>
             <w:r>
               <w:rPr>
@@ -5195,7 +5135,7 @@
         </w:tc>
         <w:tc>
           <w:tcPr>
-            <w:tcW w:type="dxa" w:w="1701"/>
+            <w:tcW w:type="dxa" w:w="1644"/>
             <w:shd w:val="clear" w:color="auto" w:fill="DCE6F0"/>
             <w:tcMar>
               <w:top w:w="40" w:type="dxa"/>
@@ -5207,6 +5147,7 @@
           <w:p>
             <w:pPr>
               <w:pStyle w:val="TableText"/>
+              <w:keepNext/>
             </w:pPr>
             <w:r>
               <w:rPr>
@@ -5224,7 +5165,7 @@
         </w:trPr>
         <w:tc>
           <w:tcPr>
-            <w:tcW w:type="dxa" w:w="2041"/>
+            <w:tcW w:type="dxa" w:w="2154"/>
             <w:tcMar>
               <w:top w:w="40" w:type="dxa"/>
               <w:left w:w="80" w:type="dxa"/>
@@ -5235,6 +5176,7 @@
           <w:p>
             <w:pPr>
               <w:pStyle w:val="TableText"/>
+              <w:keepNext/>
             </w:pPr>
             <w:r>
               <w:rPr>
@@ -5246,7 +5188,7 @@
         </w:tc>
         <w:tc>
           <w:tcPr>
-            <w:tcW w:type="dxa" w:w="1304"/>
+            <w:tcW w:type="dxa" w:w="1361"/>
             <w:tcMar>
               <w:top w:w="40" w:type="dxa"/>
               <w:left w:w="80" w:type="dxa"/>
@@ -5257,6 +5199,7 @@
           <w:p>
             <w:pPr>
               <w:pStyle w:val="TableText"/>
+              <w:keepNext/>
             </w:pPr>
             <w:r>
               <w:rPr>
@@ -5268,7 +5211,7 @@
         </w:tc>
         <w:tc>
           <w:tcPr>
-            <w:tcW w:type="dxa" w:w="4025"/>
+            <w:tcW w:type="dxa" w:w="3912"/>
             <w:tcMar>
               <w:top w:w="40" w:type="dxa"/>
               <w:left w:w="80" w:type="dxa"/>
@@ -5279,6 +5222,7 @@
           <w:p>
             <w:pPr>
               <w:pStyle w:val="TableText"/>
+              <w:keepNext/>
             </w:pPr>
             <w:r>
               <w:rPr>
@@ -5290,7 +5234,7 @@
         </w:tc>
         <w:tc>
           <w:tcPr>
-            <w:tcW w:type="dxa" w:w="1701"/>
+            <w:tcW w:type="dxa" w:w="1644"/>
             <w:tcMar>
               <w:top w:w="40" w:type="dxa"/>
               <w:left w:w="80" w:type="dxa"/>
@@ -5301,6 +5245,7 @@
           <w:p>
             <w:pPr>
               <w:pStyle w:val="TableText"/>
+              <w:keepNext/>
             </w:pPr>
             <w:r>
               <w:rPr>
@@ -5317,7 +5262,117 @@
         </w:trPr>
         <w:tc>
           <w:tcPr>
-            <w:tcW w:type="dxa" w:w="2041"/>
+            <w:tcW w:type="dxa" w:w="2154"/>
+            <w:tcMar>
+              <w:top w:w="40" w:type="dxa"/>
+              <w:left w:w="80" w:type="dxa"/>
+              <w:bottom w:w="40" w:type="dxa"/>
+              <w:right w:w="80" w:type="dxa"/>
+            </w:tcMar>
+          </w:tcPr>
+          <w:p>
+            <w:pPr>
+              <w:pStyle w:val="TableText"/>
+              <w:keepNext/>
+            </w:pPr>
+            <w:r>
+              <w:rPr>
+                <w:sz w:val="18"/>
+              </w:rPr>
+              <w:t>arduinobot_cpp_examples</w:t>
+            </w:r>
+          </w:p>
+        </w:tc>
+        <w:tc>
+          <w:tcPr>
+            <w:tcW w:type="dxa" w:w="1361"/>
+            <w:tcMar>
+              <w:top w:w="40" w:type="dxa"/>
+              <w:left w:w="80" w:type="dxa"/>
+              <w:bottom w:w="40" w:type="dxa"/>
+              <w:right w:w="80" w:type="dxa"/>
+            </w:tcMar>
+          </w:tcPr>
+          <w:p>
+            <w:pPr>
+              <w:pStyle w:val="TableText"/>
+              <w:keepNext/>
+            </w:pPr>
+            <w:r>
+              <w:rPr>
+                <w:sz w:val="18"/>
+              </w:rPr>
+              <w:t>ament_cmake</w:t>
+            </w:r>
+          </w:p>
+        </w:tc>
+        <w:tc>
+          <w:tcPr>
+            <w:tcW w:type="dxa" w:w="3912"/>
+            <w:tcMar>
+              <w:top w:w="40" w:type="dxa"/>
+              <w:left w:w="80" w:type="dxa"/>
+              <w:bottom w:w="40" w:type="dxa"/>
+              <w:right w:w="80" w:type="dxa"/>
+            </w:tcMar>
+          </w:tcPr>
+          <w:p>
+            <w:pPr>
+              <w:pStyle w:val="TableText"/>
+              <w:keepNext/>
+            </w:pPr>
+            <w:r>
+              <w:rPr>
+                <w:sz w:val="18"/>
+              </w:rPr>
+              <w:t>depend: rclcpp, std_msgs, rcl_interfaces</w:t>
+            </w:r>
+          </w:p>
+        </w:tc>
+        <w:tc>
+          <w:tcPr>
+            <w:tcW w:type="dxa" w:w="1644"/>
+            <w:tcMar>
+              <w:top w:w="40" w:type="dxa"/>
+              <w:left w:w="80" w:type="dxa"/>
+              <w:bottom w:w="40" w:type="dxa"/>
+              <w:right w:w="80" w:type="dxa"/>
+            </w:tcMar>
+          </w:tcPr>
+          <w:p>
+            <w:pPr>
+              <w:pStyle w:val="TableText"/>
+              <w:keepNext/>
+            </w:pPr>
+            <w:r>
+              <w:rPr>
+                <w:sz w:val="18"/>
+              </w:rPr>
+              <w:t>3 executables (</w:t>
+            </w:r>
+            <w:r>
+              <w:rPr>
+                <w:rFonts w:ascii="Courier New" w:hAnsi="Courier New" w:cs="Courier New" w:eastAsia="Courier New"/>
+                <w:sz w:val="15"/>
+              </w:rPr>
+              <w:t>lib/</w:t>
+            </w:r>
+            <w:r>
+              <w:rPr>
+                <w:sz w:val="18"/>
+              </w:rPr>
+              <w:t>)</w:t>
+            </w:r>
+          </w:p>
+        </w:tc>
+      </w:tr>
+      <w:tr>
+        <w:trPr>
+          <w:cantSplit/>
+        </w:trPr>
+        <w:tc>
+          <w:tcPr>
+            <w:tcW w:type="dxa" w:w="2154"/>
             <w:tcMar>
               <w:top w:w="40" w:type="dxa"/>
               <w:left w:w="80" w:type="dxa"/>
@@ -5333,13 +5388,13 @@
               <w:rPr>
                 <w:sz w:val="18"/>
               </w:rPr>
-              <w:t>arduinobot_cpp_examples</w:t>
+              <w:t>arduinobot_description</w:t>
             </w:r>
           </w:p>
         </w:tc>
         <w:tc>
           <w:tcPr>
-            <w:tcW w:type="dxa" w:w="1304"/>
+            <w:tcW w:type="dxa" w:w="1361"/>
             <w:tcMar>
               <w:top w:w="40" w:type="dxa"/>
               <w:left w:w="80" w:type="dxa"/>
@@ -5361,107 +5416,7 @@
         </w:tc>
         <w:tc>
           <w:tcPr>
-            <w:tcW w:type="dxa" w:w="4025"/>
-            <w:tcMar>
-              <w:top w:w="40" w:type="dxa"/>
-              <w:left w:w="80" w:type="dxa"/>
-              <w:bottom w:w="40" w:type="dxa"/>
-              <w:right w:w="80" w:type="dxa"/>
-            </w:tcMar>
-          </w:tcPr>
-          <w:p>
-            <w:pPr>
-              <w:pStyle w:val="TableText"/>
-            </w:pPr>
-            <w:r>
-              <w:rPr>
-                <w:sz w:val="18"/>
-              </w:rPr>
-              <w:t>depend: rclcpp, std_msgs, rcl_interfaces</w:t>
-            </w:r>
-          </w:p>
-        </w:tc>
-        <w:tc>
-          <w:tcPr>
-            <w:tcW w:type="dxa" w:w="1701"/>
-            <w:tcMar>
-              <w:top w:w="40" w:type="dxa"/>
-              <w:left w:w="80" w:type="dxa"/>
-              <w:bottom w:w="40" w:type="dxa"/>
-              <w:right w:w="80" w:type="dxa"/>
-            </w:tcMar>
-          </w:tcPr>
-          <w:p>
-            <w:pPr>
-              <w:pStyle w:val="TableText"/>
-            </w:pPr>
-            <w:r>
-              <w:rPr>
-                <w:sz w:val="18"/>
-              </w:rPr>
-              <w:t xml:space="preserve">3 executables in </w:t>
-            </w:r>
-            <w:r>
-              <w:rPr>
-                <w:rFonts w:ascii="Courier New" w:hAnsi="Courier New" w:cs="Courier New" w:eastAsia="Courier New"/>
-                <w:sz w:val="15"/>
-              </w:rPr>
-              <w:t>lib/arduinobot_cpp_examples</w:t>
-            </w:r>
-          </w:p>
-        </w:tc>
-      </w:tr>
-      <w:tr>
-        <w:trPr>
-          <w:cantSplit/>
-        </w:trPr>
-        <w:tc>
-          <w:tcPr>
-            <w:tcW w:type="dxa" w:w="2041"/>
-            <w:tcMar>
-              <w:top w:w="40" w:type="dxa"/>
-              <w:left w:w="80" w:type="dxa"/>
-              <w:bottom w:w="40" w:type="dxa"/>
-              <w:right w:w="80" w:type="dxa"/>
-            </w:tcMar>
-          </w:tcPr>
-          <w:p>
-            <w:pPr>
-              <w:pStyle w:val="TableText"/>
-            </w:pPr>
-            <w:r>
-              <w:rPr>
-                <w:sz w:val="18"/>
-              </w:rPr>
-              <w:t>arduinobot_description</w:t>
-            </w:r>
-          </w:p>
-        </w:tc>
-        <w:tc>
-          <w:tcPr>
-            <w:tcW w:type="dxa" w:w="1304"/>
-            <w:tcMar>
-              <w:top w:w="40" w:type="dxa"/>
-              <w:left w:w="80" w:type="dxa"/>
-              <w:bottom w:w="40" w:type="dxa"/>
-              <w:right w:w="80" w:type="dxa"/>
-            </w:tcMar>
-          </w:tcPr>
-          <w:p>
-            <w:pPr>
-              <w:pStyle w:val="TableText"/>
-            </w:pPr>
-            <w:r>
-              <w:rPr>
-                <w:sz w:val="18"/>
-              </w:rPr>
-              <w:t>ament_cmake</w:t>
-            </w:r>
-          </w:p>
-        </w:tc>
-        <w:tc>
-          <w:tcPr>
-            <w:tcW w:type="dxa" w:w="4025"/>
+            <w:tcW w:type="dxa" w:w="3912"/>
             <w:tcMar>
               <w:top w:w="40" w:type="dxa"/>
               <w:left w:w="80" w:type="dxa"/>
@@ -5483,7 +5438,7 @@
         </w:tc>
         <w:tc>
           <w:tcPr>
-            <w:tcW w:type="dxa" w:w="1701"/>
+            <w:tcW w:type="dxa" w:w="1644"/>
             <w:tcMar>
               <w:top w:w="40" w:type="dxa"/>
               <w:left w:w="80" w:type="dxa"/>
@@ -5737,7 +5692,7 @@
             <w:r>
               <w:drawing>
                 <wp:inline xmlns:a="http://schemas.openxmlformats.org/drawingml/2006/main" xmlns:pic="http://schemas.openxmlformats.org/drawingml/2006/picture">
-                  <wp:extent cx="2664000" cy="3848839"/>
+                  <wp:extent cx="2664000" cy="3436319"/>
                   <wp:docPr id="4" name="Picture 4"/>
                   <wp:cNvGraphicFramePr>
                     <a:graphicFrameLocks noChangeAspect="1"/>
@@ -5758,7 +5713,7 @@
                         <pic:spPr>
                           <a:xfrm>
                             <a:off x="0" y="0"/>
-                            <a:ext cx="2664000" cy="3848839"/>
+                            <a:ext cx="2664000" cy="3436319"/>
                           </a:xfrm>
                           <a:prstGeom prst="rect"/>
                         </pic:spPr>
@@ -5916,7 +5871,7 @@
             <w:r>
               <w:drawing>
                 <wp:inline xmlns:a="http://schemas.openxmlformats.org/drawingml/2006/main" xmlns:pic="http://schemas.openxmlformats.org/drawingml/2006/picture">
-                  <wp:extent cx="2736000" cy="2736000"/>
+                  <wp:extent cx="2736000" cy="2790227"/>
                   <wp:docPr id="5" name="Picture 5"/>
                   <wp:cNvGraphicFramePr>
                     <a:graphicFrameLocks noChangeAspect="1"/>
@@ -5937,7 +5892,7 @@
                         <pic:spPr>
                           <a:xfrm>
                             <a:off x="0" y="0"/>
-                            <a:ext cx="2736000" cy="2736000"/>
+                            <a:ext cx="2736000" cy="2790227"/>
                           </a:xfrm>
                           <a:prstGeom prst="rect"/>
                         </pic:spPr>
@@ -6085,11 +6040,11 @@
         <w:tblLook w:firstColumn="1" w:firstRow="1" w:lastColumn="0" w:lastRow="0" w:noHBand="0" w:noVBand="1" w:val="04A0"/>
       </w:tblPr>
       <w:tblGrid>
-        <w:gridCol w:w="2040"/>
-        <w:gridCol w:w="1190"/>
-        <w:gridCol w:w="2607"/>
-        <w:gridCol w:w="1360"/>
-        <w:gridCol w:w="566"/>
+        <w:gridCol w:w="2437"/>
+        <w:gridCol w:w="1077"/>
+        <w:gridCol w:w="2437"/>
+        <w:gridCol w:w="1303"/>
+        <w:gridCol w:w="510"/>
         <w:gridCol w:w="1303"/>
       </w:tblGrid>
       <w:tr>
@@ -6099,7 +6054,7 @@
         </w:trPr>
         <w:tc>
           <w:tcPr>
-            <w:tcW w:type="dxa" w:w="2041"/>
+            <w:tcW w:type="dxa" w:w="2438"/>
             <w:shd w:val="clear" w:color="auto" w:fill="DCE6F0"/>
             <w:tcMar>
               <w:top w:w="40" w:type="dxa"/>
@@ -6123,7 +6078,7 @@
         </w:tc>
         <w:tc>
           <w:tcPr>
-            <w:tcW w:type="dxa" w:w="1191"/>
+            <w:tcW w:type="dxa" w:w="1077"/>
             <w:shd w:val="clear" w:color="auto" w:fill="DCE6F0"/>
             <w:tcMar>
               <w:top w:w="40" w:type="dxa"/>
@@ -6147,7 +6102,7 @@
         </w:tc>
         <w:tc>
           <w:tcPr>
-            <w:tcW w:type="dxa" w:w="2608"/>
+            <w:tcW w:type="dxa" w:w="2438"/>
             <w:shd w:val="clear" w:color="auto" w:fill="DCE6F0"/>
             <w:tcMar>
               <w:top w:w="40" w:type="dxa"/>
@@ -6171,7 +6126,7 @@
         </w:tc>
         <w:tc>
           <w:tcPr>
-            <w:tcW w:type="dxa" w:w="1361"/>
+            <w:tcW w:type="dxa" w:w="1304"/>
             <w:shd w:val="clear" w:color="auto" w:fill="DCE6F0"/>
             <w:tcMar>
               <w:top w:w="40" w:type="dxa"/>
@@ -6195,7 +6150,7 @@
         </w:tc>
         <w:tc>
           <w:tcPr>
-            <w:tcW w:type="dxa" w:w="567"/>
+            <w:tcW w:type="dxa" w:w="510"/>
             <w:shd w:val="clear" w:color="auto" w:fill="DCE6F0"/>
             <w:tcMar>
               <w:top w:w="40" w:type="dxa"/>
@@ -6248,7 +6203,7 @@
         </w:trPr>
         <w:tc>
           <w:tcPr>
-            <w:tcW w:type="dxa" w:w="2041"/>
+            <w:tcW w:type="dxa" w:w="2438"/>
             <w:tcMar>
               <w:top w:w="40" w:type="dxa"/>
               <w:left w:w="80" w:type="dxa"/>
@@ -6270,7 +6225,7 @@
         </w:tc>
         <w:tc>
           <w:tcPr>
-            <w:tcW w:type="dxa" w:w="1191"/>
+            <w:tcW w:type="dxa" w:w="1077"/>
             <w:tcMar>
               <w:top w:w="40" w:type="dxa"/>
               <w:left w:w="80" w:type="dxa"/>
@@ -6292,7 +6247,7 @@
         </w:tc>
         <w:tc>
           <w:tcPr>
-            <w:tcW w:type="dxa" w:w="2608"/>
+            <w:tcW w:type="dxa" w:w="2438"/>
             <w:tcMar>
               <w:top w:w="40" w:type="dxa"/>
               <w:left w:w="80" w:type="dxa"/>
@@ -6314,7 +6269,7 @@
         </w:tc>
         <w:tc>
           <w:tcPr>
-            <w:tcW w:type="dxa" w:w="1361"/>
+            <w:tcW w:type="dxa" w:w="1304"/>
             <w:tcMar>
               <w:top w:w="40" w:type="dxa"/>
               <w:left w:w="80" w:type="dxa"/>
@@ -6336,7 +6291,7 @@
         </w:tc>
         <w:tc>
           <w:tcPr>
-            <w:tcW w:type="dxa" w:w="567"/>
+            <w:tcW w:type="dxa" w:w="510"/>
             <w:tcMar>
               <w:top w:w="40" w:type="dxa"/>
               <w:left w:w="80" w:type="dxa"/>
@@ -6385,7 +6340,7 @@
         </w:trPr>
         <w:tc>
           <w:tcPr>
-            <w:tcW w:type="dxa" w:w="2041"/>
+            <w:tcW w:type="dxa" w:w="2438"/>
             <w:tcMar>
               <w:top w:w="40" w:type="dxa"/>
               <w:left w:w="80" w:type="dxa"/>
@@ -6407,7 +6362,7 @@
         </w:tc>
         <w:tc>
           <w:tcPr>
-            <w:tcW w:type="dxa" w:w="1191"/>
+            <w:tcW w:type="dxa" w:w="1077"/>
             <w:tcMar>
               <w:top w:w="40" w:type="dxa"/>
               <w:left w:w="80" w:type="dxa"/>
@@ -6429,7 +6384,7 @@
         </w:tc>
         <w:tc>
           <w:tcPr>
-            <w:tcW w:type="dxa" w:w="2608"/>
+            <w:tcW w:type="dxa" w:w="2438"/>
             <w:tcMar>
               <w:top w:w="40" w:type="dxa"/>
               <w:left w:w="80" w:type="dxa"/>
@@ -6451,7 +6406,7 @@
         </w:tc>
         <w:tc>
           <w:tcPr>
-            <w:tcW w:type="dxa" w:w="1361"/>
+            <w:tcW w:type="dxa" w:w="1304"/>
             <w:tcMar>
               <w:top w:w="40" w:type="dxa"/>
               <w:left w:w="80" w:type="dxa"/>
@@ -6473,7 +6428,7 @@
         </w:tc>
         <w:tc>
           <w:tcPr>
-            <w:tcW w:type="dxa" w:w="567"/>
+            <w:tcW w:type="dxa" w:w="510"/>
             <w:tcMar>
               <w:top w:w="40" w:type="dxa"/>
               <w:left w:w="80" w:type="dxa"/>
@@ -6522,7 +6477,7 @@
         </w:trPr>
         <w:tc>
           <w:tcPr>
-            <w:tcW w:type="dxa" w:w="2041"/>
+            <w:tcW w:type="dxa" w:w="2438"/>
             <w:tcMar>
               <w:top w:w="40" w:type="dxa"/>
               <w:left w:w="80" w:type="dxa"/>
@@ -6544,7 +6499,7 @@
         </w:tc>
         <w:tc>
           <w:tcPr>
-            <w:tcW w:type="dxa" w:w="1191"/>
+            <w:tcW w:type="dxa" w:w="1077"/>
             <w:tcMar>
               <w:top w:w="40" w:type="dxa"/>
               <w:left w:w="80" w:type="dxa"/>
@@ -6566,7 +6521,7 @@
         </w:tc>
         <w:tc>
           <w:tcPr>
-            <w:tcW w:type="dxa" w:w="2608"/>
+            <w:tcW w:type="dxa" w:w="2438"/>
             <w:tcMar>
               <w:top w:w="40" w:type="dxa"/>
               <w:left w:w="80" w:type="dxa"/>
@@ -6588,7 +6543,7 @@
         </w:tc>
         <w:tc>
           <w:tcPr>
-            <w:tcW w:type="dxa" w:w="1361"/>
+            <w:tcW w:type="dxa" w:w="1304"/>
             <w:tcMar>
               <w:top w:w="40" w:type="dxa"/>
               <w:left w:w="80" w:type="dxa"/>
@@ -6610,7 +6565,7 @@
         </w:tc>
         <w:tc>
           <w:tcPr>
-            <w:tcW w:type="dxa" w:w="567"/>
+            <w:tcW w:type="dxa" w:w="510"/>
             <w:tcMar>
               <w:top w:w="40" w:type="dxa"/>
               <w:left w:w="80" w:type="dxa"/>
@@ -6659,7 +6614,7 @@
         </w:trPr>
         <w:tc>
           <w:tcPr>
-            <w:tcW w:type="dxa" w:w="2041"/>
+            <w:tcW w:type="dxa" w:w="2438"/>
             <w:tcMar>
               <w:top w:w="40" w:type="dxa"/>
               <w:left w:w="80" w:type="dxa"/>
@@ -6681,7 +6636,7 @@
         </w:tc>
         <w:tc>
           <w:tcPr>
-            <w:tcW w:type="dxa" w:w="1191"/>
+            <w:tcW w:type="dxa" w:w="1077"/>
             <w:tcMar>
               <w:top w:w="40" w:type="dxa"/>
               <w:left w:w="80" w:type="dxa"/>
@@ -6703,7 +6658,7 @@
         </w:tc>
         <w:tc>
           <w:tcPr>
-            <w:tcW w:type="dxa" w:w="2608"/>
+            <w:tcW w:type="dxa" w:w="2438"/>
             <w:tcMar>
               <w:top w:w="40" w:type="dxa"/>
               <w:left w:w="80" w:type="dxa"/>
@@ -6725,7 +6680,7 @@
         </w:tc>
         <w:tc>
           <w:tcPr>
-            <w:tcW w:type="dxa" w:w="1361"/>
+            <w:tcW w:type="dxa" w:w="1304"/>
             <w:tcMar>
               <w:top w:w="40" w:type="dxa"/>
               <w:left w:w="80" w:type="dxa"/>
@@ -6747,7 +6702,7 @@
         </w:tc>
         <w:tc>
           <w:tcPr>
-            <w:tcW w:type="dxa" w:w="567"/>
+            <w:tcW w:type="dxa" w:w="510"/>
             <w:tcMar>
               <w:top w:w="40" w:type="dxa"/>
               <w:left w:w="80" w:type="dxa"/>
@@ -6796,7 +6751,7 @@
         </w:trPr>
         <w:tc>
           <w:tcPr>
-            <w:tcW w:type="dxa" w:w="2041"/>
+            <w:tcW w:type="dxa" w:w="2438"/>
             <w:tcMar>
               <w:top w:w="40" w:type="dxa"/>
               <w:left w:w="80" w:type="dxa"/>
@@ -6818,7 +6773,7 @@
         </w:tc>
         <w:tc>
           <w:tcPr>
-            <w:tcW w:type="dxa" w:w="1191"/>
+            <w:tcW w:type="dxa" w:w="1077"/>
             <w:tcMar>
               <w:top w:w="40" w:type="dxa"/>
               <w:left w:w="80" w:type="dxa"/>
@@ -6840,7 +6795,7 @@
         </w:tc>
         <w:tc>
           <w:tcPr>
-            <w:tcW w:type="dxa" w:w="2608"/>
+            <w:tcW w:type="dxa" w:w="2438"/>
             <w:tcMar>
               <w:top w:w="40" w:type="dxa"/>
               <w:left w:w="80" w:type="dxa"/>
@@ -6862,7 +6817,7 @@
         </w:tc>
         <w:tc>
           <w:tcPr>
-            <w:tcW w:type="dxa" w:w="1361"/>
+            <w:tcW w:type="dxa" w:w="1304"/>
             <w:tcMar>
               <w:top w:w="40" w:type="dxa"/>
               <w:left w:w="80" w:type="dxa"/>
@@ -6884,7 +6839,7 @@
         </w:tc>
         <w:tc>
           <w:tcPr>
-            <w:tcW w:type="dxa" w:w="567"/>
+            <w:tcW w:type="dxa" w:w="510"/>
             <w:tcMar>
               <w:top w:w="40" w:type="dxa"/>
               <w:left w:w="80" w:type="dxa"/>
@@ -6933,7 +6888,7 @@
         </w:trPr>
         <w:tc>
           <w:tcPr>
-            <w:tcW w:type="dxa" w:w="2041"/>
+            <w:tcW w:type="dxa" w:w="2438"/>
             <w:tcMar>
               <w:top w:w="40" w:type="dxa"/>
               <w:left w:w="80" w:type="dxa"/>
@@ -6955,7 +6910,7 @@
         </w:tc>
         <w:tc>
           <w:tcPr>
-            <w:tcW w:type="dxa" w:w="1191"/>
+            <w:tcW w:type="dxa" w:w="1077"/>
             <w:tcMar>
               <w:top w:w="40" w:type="dxa"/>
               <w:left w:w="80" w:type="dxa"/>
@@ -6977,7 +6932,7 @@
         </w:tc>
         <w:tc>
           <w:tcPr>
-            <w:tcW w:type="dxa" w:w="2608"/>
+            <w:tcW w:type="dxa" w:w="2438"/>
             <w:tcMar>
               <w:top w:w="40" w:type="dxa"/>
               <w:left w:w="80" w:type="dxa"/>
@@ -6999,7 +6954,7 @@
         </w:tc>
         <w:tc>
           <w:tcPr>
-            <w:tcW w:type="dxa" w:w="1361"/>
+            <w:tcW w:type="dxa" w:w="1304"/>
             <w:tcMar>
               <w:top w:w="40" w:type="dxa"/>
               <w:left w:w="80" w:type="dxa"/>
@@ -7021,7 +6976,7 @@
         </w:tc>
         <w:tc>
           <w:tcPr>
-            <w:tcW w:type="dxa" w:w="567"/>
+            <w:tcW w:type="dxa" w:w="510"/>
             <w:tcMar>
               <w:top w:w="40" w:type="dxa"/>
               <w:left w:w="80" w:type="dxa"/>
@@ -7070,7 +7025,7 @@
         </w:trPr>
         <w:tc>
           <w:tcPr>
-            <w:tcW w:type="dxa" w:w="2041"/>
+            <w:tcW w:type="dxa" w:w="2438"/>
             <w:tcMar>
               <w:top w:w="40" w:type="dxa"/>
               <w:left w:w="80" w:type="dxa"/>
@@ -7092,7 +7047,7 @@
         </w:tc>
         <w:tc>
           <w:tcPr>
-            <w:tcW w:type="dxa" w:w="1191"/>
+            <w:tcW w:type="dxa" w:w="1077"/>
             <w:tcMar>
               <w:top w:w="40" w:type="dxa"/>
               <w:left w:w="80" w:type="dxa"/>
@@ -7114,7 +7069,7 @@
         </w:tc>
         <w:tc>
           <w:tcPr>
-            <w:tcW w:type="dxa" w:w="2608"/>
+            <w:tcW w:type="dxa" w:w="2438"/>
             <w:tcMar>
               <w:top w:w="40" w:type="dxa"/>
               <w:left w:w="80" w:type="dxa"/>
@@ -7136,7 +7091,7 @@
         </w:tc>
         <w:tc>
           <w:tcPr>
-            <w:tcW w:type="dxa" w:w="1361"/>
+            <w:tcW w:type="dxa" w:w="1304"/>
             <w:tcMar>
               <w:top w:w="40" w:type="dxa"/>
               <w:left w:w="80" w:type="dxa"/>
@@ -7158,7 +7113,7 @@
         </w:tc>
         <w:tc>
           <w:tcPr>
-            <w:tcW w:type="dxa" w:w="567"/>
+            <w:tcW w:type="dxa" w:w="510"/>
             <w:tcMar>
               <w:top w:w="40" w:type="dxa"/>
               <w:left w:w="80" w:type="dxa"/>
@@ -7772,7 +7727,7 @@
         <w:t>joint_3</w:t>
       </w:r>
       <w:r>
-        <w:t xml:space="preserve"> at 0.8 m equals the 80-unit bore spacing. Course diagrams reproduced in the notes give the corresponding real offsets in centimetres, e.g. 3.07 cm where the URDF uses 0.307 m (1.4, lesson 32, p84–p89) [4], [6]. The software model is therefore about ten times the physical size. It was deliberately not rescaled, because a correct rescale would require changing every origin and no measured dimensions of a built robot are available; model values in this report are quoted as model values.</w:t>
+        <w:t xml:space="preserve"> at 0.8 m equals the 80-unit bore spacing. Course video frames reproduced in the notes give the corresponding real offsets in centimetres – 3.5 cm, 8 cm and 8.2 cm where the URDF uses 0.35 m, 0.8 m and 0.82 m (1.4, lesson 32, p86–p88) [4], [6]. The software model is therefore about ten times the physical size. It was deliberately not rescaled, because a correct rescale would require changing every origin and no measured dimensions of a built robot are available; model values in this report are quoted as model values.</w:t>
       </w:r>
     </w:p>
     <w:p>
@@ -7968,7 +7923,7 @@
       <w:r>
         <w:drawing>
           <wp:inline xmlns:a="http://schemas.openxmlformats.org/drawingml/2006/main" xmlns:pic="http://schemas.openxmlformats.org/drawingml/2006/picture">
-            <wp:extent cx="5760000" cy="2090244"/>
+            <wp:extent cx="5760000" cy="2320400"/>
             <wp:docPr id="6" name="Picture 6"/>
             <wp:cNvGraphicFramePr>
               <a:graphicFrameLocks noChangeAspect="1"/>
@@ -7989,7 +7944,7 @@
                   <pic:spPr>
                     <a:xfrm>
                       <a:off x="0" y="0"/>
-                      <a:ext cx="5760000" cy="2090244"/>
+                      <a:ext cx="5760000" cy="2320400"/>
                     </a:xfrm>
                     <a:prstGeom prst="rect"/>
                   </pic:spPr>
@@ -8149,7 +8104,7 @@
         <w:fldChar w:fldCharType="end"/>
       </w:r>
       <w:r>
-        <w:t xml:space="preserve">: the two fixed joints appear as static transforms and the five movable joints at about 10 Hz [44], [9]. </w:t>
+        <w:t xml:space="preserve">: the two fixed joints appear as static transforms and the five movable joints at about 10 Hz [9], [44]. </w:t>
       </w:r>
       <w:r>
         <w:rPr>
@@ -8209,7 +8164,7 @@
       <w:r>
         <w:drawing>
           <wp:inline xmlns:a="http://schemas.openxmlformats.org/drawingml/2006/main" xmlns:pic="http://schemas.openxmlformats.org/drawingml/2006/picture">
-            <wp:extent cx="2592000" cy="3517307"/>
+            <wp:extent cx="2520000" cy="3061812"/>
             <wp:docPr id="7" name="Picture 7"/>
             <wp:cNvGraphicFramePr>
               <a:graphicFrameLocks noChangeAspect="1"/>
@@ -8230,7 +8185,7 @@
                   <pic:spPr>
                     <a:xfrm>
                       <a:off x="0" y="0"/>
-                      <a:ext cx="2592000" cy="3517307"/>
+                      <a:ext cx="2520000" cy="3061812"/>
                     </a:xfrm>
                     <a:prstGeom prst="rect"/>
                   </pic:spPr>
@@ -8442,7 +8397,7 @@
       <w:r>
         <w:drawing>
           <wp:inline xmlns:a="http://schemas.openxmlformats.org/drawingml/2006/main" xmlns:pic="http://schemas.openxmlformats.org/drawingml/2006/picture">
-            <wp:extent cx="5400000" cy="3261791"/>
+            <wp:extent cx="4860000" cy="2935612"/>
             <wp:docPr id="8" name="Picture 8"/>
             <wp:cNvGraphicFramePr>
               <a:graphicFrameLocks noChangeAspect="1"/>
@@ -8463,7 +8418,7 @@
                   <pic:spPr>
                     <a:xfrm>
                       <a:off x="0" y="0"/>
-                      <a:ext cx="5400000" cy="3261791"/>
+                      <a:ext cx="4860000" cy="2935612"/>
                     </a:xfrm>
                     <a:prstGeom prst="rect"/>
                   </pic:spPr>
@@ -10076,7 +10031,7 @@
         <w:t>%d</w:t>
       </w:r>
       <w:r>
-        <w:t xml:space="preserve">, which would raise a </w:t>
+        <w:t xml:space="preserve">, which – once re-indented – would raise a </w:t>
       </w:r>
       <w:r>
         <w:rPr>
@@ -10189,7 +10144,7 @@
         <w:t>ros-humble-ros-gz*</w:t>
       </w:r>
       <w:r>
-        <w:t xml:space="preserve"> (1.2, lesson 14) [2].</w:t>
+        <w:t xml:space="preserve"> (1.2, lesson 14) [2], [48].</w:t>
       </w:r>
     </w:p>
     <w:p>
@@ -11748,7 +11703,7 @@
       <w:r>
         <w:drawing>
           <wp:inline xmlns:a="http://schemas.openxmlformats.org/drawingml/2006/main" xmlns:pic="http://schemas.openxmlformats.org/drawingml/2006/picture">
-            <wp:extent cx="4860000" cy="1942033"/>
+            <wp:extent cx="4860000" cy="2078692"/>
             <wp:docPr id="11" name="Picture 11"/>
             <wp:cNvGraphicFramePr>
               <a:graphicFrameLocks noChangeAspect="1"/>
@@ -11769,7 +11724,7 @@
                   <pic:spPr>
                     <a:xfrm>
                       <a:off x="0" y="0"/>
-                      <a:ext cx="4860000" cy="1942033"/>
+                      <a:ext cx="4860000" cy="2078692"/>
                     </a:xfrm>
                     <a:prstGeom prst="rect"/>
                   </pic:spPr>
@@ -13067,8 +13022,8 @@
         <w:tblLook w:firstColumn="1" w:firstRow="1" w:lastColumn="0" w:lastRow="0" w:noHBand="0" w:noVBand="1" w:val="04A0"/>
       </w:tblPr>
       <w:tblGrid>
-        <w:gridCol w:w="2381"/>
-        <w:gridCol w:w="6689"/>
+        <w:gridCol w:w="2040"/>
+        <w:gridCol w:w="7029"/>
       </w:tblGrid>
       <w:tr>
         <w:trPr>
@@ -13077,8 +13032,215 @@
         </w:trPr>
         <w:tc>
           <w:tcPr>
-            <w:tcW w:type="dxa" w:w="2381"/>
+            <w:tcW w:type="dxa" w:w="2041"/>
             <w:shd w:val="clear" w:color="auto" w:fill="DCE6F0"/>
+            <w:tcMar>
+              <w:top w:w="40" w:type="dxa"/>
+              <w:left w:w="80" w:type="dxa"/>
+              <w:bottom w:w="40" w:type="dxa"/>
+              <w:right w:w="80" w:type="dxa"/>
+            </w:tcMar>
+          </w:tcPr>
+          <w:p>
+            <w:pPr>
+              <w:pStyle w:val="TableText"/>
+              <w:keepNext/>
+            </w:pPr>
+            <w:r>
+              <w:rPr>
+                <w:b/>
+                <w:sz w:val="18"/>
+              </w:rPr>
+              <w:t>Category</w:t>
+            </w:r>
+          </w:p>
+        </w:tc>
+        <w:tc>
+          <w:tcPr>
+            <w:tcW w:type="dxa" w:w="7030"/>
+            <w:shd w:val="clear" w:color="auto" w:fill="DCE6F0"/>
+            <w:tcMar>
+              <w:top w:w="40" w:type="dxa"/>
+              <w:left w:w="80" w:type="dxa"/>
+              <w:bottom w:w="40" w:type="dxa"/>
+              <w:right w:w="80" w:type="dxa"/>
+            </w:tcMar>
+          </w:tcPr>
+          <w:p>
+            <w:pPr>
+              <w:pStyle w:val="TableText"/>
+              <w:keepNext/>
+            </w:pPr>
+            <w:r>
+              <w:rPr>
+                <w:b/>
+                <w:sz w:val="18"/>
+              </w:rPr>
+              <w:t>Status</w:t>
+            </w:r>
+          </w:p>
+        </w:tc>
+      </w:tr>
+      <w:tr>
+        <w:trPr>
+          <w:cantSplit/>
+        </w:trPr>
+        <w:tc>
+          <w:tcPr>
+            <w:tcW w:type="dxa" w:w="2041"/>
+            <w:tcMar>
+              <w:top w:w="40" w:type="dxa"/>
+              <w:left w:w="80" w:type="dxa"/>
+              <w:bottom w:w="40" w:type="dxa"/>
+              <w:right w:w="80" w:type="dxa"/>
+            </w:tcMar>
+          </w:tcPr>
+          <w:p>
+            <w:pPr>
+              <w:pStyle w:val="TableText"/>
+              <w:keepNext/>
+            </w:pPr>
+            <w:r>
+              <w:rPr>
+                <w:sz w:val="18"/>
+              </w:rPr>
+              <w:t>A – Documented student work</w:t>
+            </w:r>
+          </w:p>
+        </w:tc>
+        <w:tc>
+          <w:tcPr>
+            <w:tcW w:type="dxa" w:w="7030"/>
+            <w:tcMar>
+              <w:top w:w="40" w:type="dxa"/>
+              <w:left w:w="80" w:type="dxa"/>
+              <w:bottom w:w="40" w:type="dxa"/>
+              <w:right w:w="80" w:type="dxa"/>
+            </w:tcMar>
+          </w:tcPr>
+          <w:p>
+            <w:pPr>
+              <w:pStyle w:val="TableText"/>
+              <w:keepNext/>
+            </w:pPr>
+            <w:r>
+              <w:rPr>
+                <w:sz w:val="18"/>
+              </w:rPr>
+              <w:t>ROS 2 Humble and tools installed; development environment configured; workspace and both example packages created; Python and C++ publishers and subscribers built and run; topic inspection; both cross-language directions; description package and complete URDF/Xacro model visualised in RViz with urdf_tutorial; conceptual study of ROS 2 architecture, communication, packages, RViz and parameters; Python parameter lab started (code listing only). Sources: notes 1.1–1.5 [1]–[5].</w:t>
+            </w:r>
+          </w:p>
+        </w:tc>
+      </w:tr>
+      <w:tr>
+        <w:trPr>
+          <w:cantSplit/>
+        </w:trPr>
+        <w:tc>
+          <w:tcPr>
+            <w:tcW w:type="dxa" w:w="2041"/>
+            <w:tcMar>
+              <w:top w:w="40" w:type="dxa"/>
+              <w:left w:w="80" w:type="dxa"/>
+              <w:bottom w:w="40" w:type="dxa"/>
+              <w:right w:w="80" w:type="dxa"/>
+            </w:tcMar>
+          </w:tcPr>
+          <w:p>
+            <w:pPr>
+              <w:pStyle w:val="TableText"/>
+              <w:keepNext/>
+            </w:pPr>
+            <w:r>
+              <w:rPr>
+                <w:sz w:val="18"/>
+              </w:rPr>
+              <w:t>B – Instructor material</w:t>
+            </w:r>
+          </w:p>
+        </w:tc>
+        <w:tc>
+          <w:tcPr>
+            <w:tcW w:type="dxa" w:w="7030"/>
+            <w:tcMar>
+              <w:top w:w="40" w:type="dxa"/>
+              <w:left w:w="80" w:type="dxa"/>
+              <w:bottom w:w="40" w:type="dxa"/>
+              <w:right w:w="80" w:type="dxa"/>
+            </w:tcMar>
+          </w:tcPr>
+          <w:p>
+            <w:pPr>
+              <w:pStyle w:val="TableText"/>
+              <w:keepNext/>
+            </w:pPr>
+            <w:r>
+              <w:rPr>
+                <w:sz w:val="18"/>
+              </w:rPr>
+              <w:t>Section 4 packages (examples, parameter nodes, model, meshes, launch and RViz files), later sections with ros2_control, MoveIt 2, application, Alexa and firmware [6].</w:t>
+            </w:r>
+          </w:p>
+        </w:tc>
+      </w:tr>
+      <w:tr>
+        <w:trPr>
+          <w:cantSplit/>
+        </w:trPr>
+        <w:tc>
+          <w:tcPr>
+            <w:tcW w:type="dxa" w:w="2041"/>
+            <w:tcMar>
+              <w:top w:w="40" w:type="dxa"/>
+              <w:left w:w="80" w:type="dxa"/>
+              <w:bottom w:w="40" w:type="dxa"/>
+              <w:right w:w="80" w:type="dxa"/>
+            </w:tcMar>
+          </w:tcPr>
+          <w:p>
+            <w:pPr>
+              <w:pStyle w:val="TableText"/>
+              <w:keepNext/>
+            </w:pPr>
+            <w:r>
+              <w:rPr>
+                <w:sz w:val="18"/>
+              </w:rPr>
+              <w:t>C – Assignment preparation</w:t>
+            </w:r>
+          </w:p>
+        </w:tc>
+        <w:tc>
+          <w:tcPr>
+            <w:tcW w:type="dxa" w:w="7030"/>
+            <w:tcMar>
+              <w:top w:w="40" w:type="dxa"/>
+              <w:left w:w="80" w:type="dxa"/>
+              <w:bottom w:w="40" w:type="dxa"/>
+              <w:right w:w="80" w:type="dxa"/>
+            </w:tcMar>
+          </w:tcPr>
+          <w:p>
+            <w:pPr>
+              <w:pStyle w:val="TableText"/>
+              <w:keepNext/>
+            </w:pPr>
+            <w:r>
+              <w:rPr>
+                <w:sz w:val="18"/>
+              </w:rPr>
+              <w:t>Clean workspace with corrections C1–C12; build, tests and runtime checks in an Ubuntu 22.04 / Humble container; parameter demonstration; TF and RViz verification; figures, documentation and this report [9].</w:t>
+            </w:r>
+          </w:p>
+        </w:tc>
+      </w:tr>
+      <w:tr>
+        <w:trPr>
+          <w:cantSplit/>
+        </w:trPr>
+        <w:tc>
+          <w:tcPr>
+            <w:tcW w:type="dxa" w:w="2041"/>
             <w:tcMar>
               <w:top w:w="40" w:type="dxa"/>
               <w:left w:w="80" w:type="dxa"/>
@@ -13092,17 +13254,15 @@
             </w:pPr>
             <w:r>
               <w:rPr>
-                <w:b/>
-                <w:sz w:val="19"/>
+                <w:sz w:val="18"/>
               </w:rPr>
-              <w:t>Category</w:t>
+              <w:t>D – Future work (not documented in the notes)</w:t>
             </w:r>
           </w:p>
         </w:tc>
         <w:tc>
           <w:tcPr>
-            <w:tcW w:type="dxa" w:w="6690"/>
-            <w:shd w:val="clear" w:color="auto" w:fill="DCE6F0"/>
+            <w:tcW w:type="dxa" w:w="7030"/>
             <w:tcMar>
               <w:top w:w="40" w:type="dxa"/>
               <w:left w:w="80" w:type="dxa"/>
@@ -13116,204 +13276,7 @@
             </w:pPr>
             <w:r>
               <w:rPr>
-                <w:b/>
-                <w:sz w:val="19"/>
-              </w:rPr>
-              <w:t>Status</w:t>
-            </w:r>
-          </w:p>
-        </w:tc>
-      </w:tr>
-      <w:tr>
-        <w:trPr>
-          <w:cantSplit/>
-        </w:trPr>
-        <w:tc>
-          <w:tcPr>
-            <w:tcW w:type="dxa" w:w="2381"/>
-            <w:tcMar>
-              <w:top w:w="40" w:type="dxa"/>
-              <w:left w:w="80" w:type="dxa"/>
-              <w:bottom w:w="40" w:type="dxa"/>
-              <w:right w:w="80" w:type="dxa"/>
-            </w:tcMar>
-          </w:tcPr>
-          <w:p>
-            <w:pPr>
-              <w:pStyle w:val="TableText"/>
-            </w:pPr>
-            <w:r>
-              <w:rPr>
-                <w:sz w:val="19"/>
-              </w:rPr>
-              <w:t>A – Documented student work</w:t>
-            </w:r>
-          </w:p>
-        </w:tc>
-        <w:tc>
-          <w:tcPr>
-            <w:tcW w:type="dxa" w:w="6690"/>
-            <w:tcMar>
-              <w:top w:w="40" w:type="dxa"/>
-              <w:left w:w="80" w:type="dxa"/>
-              <w:bottom w:w="40" w:type="dxa"/>
-              <w:right w:w="80" w:type="dxa"/>
-            </w:tcMar>
-          </w:tcPr>
-          <w:p>
-            <w:pPr>
-              <w:pStyle w:val="TableText"/>
-            </w:pPr>
-            <w:r>
-              <w:rPr>
-                <w:sz w:val="19"/>
-              </w:rPr>
-              <w:t>ROS 2 Humble and tools installed; development environment configured; workspace and both example packages created; Python and C++ publishers and subscribers built and run; topic inspection; both cross-language directions; description package and complete URDF/Xacro model visualised in RViz with urdf_tutorial; conceptual study of ROS 2 architecture, communication, packages, RViz and parameters; Python parameter lab started (code listing only). Sources: notes 1.1–1.5 [1], [2], [3], [4], [5].</w:t>
-            </w:r>
-          </w:p>
-        </w:tc>
-      </w:tr>
-      <w:tr>
-        <w:trPr>
-          <w:cantSplit/>
-        </w:trPr>
-        <w:tc>
-          <w:tcPr>
-            <w:tcW w:type="dxa" w:w="2381"/>
-            <w:tcMar>
-              <w:top w:w="40" w:type="dxa"/>
-              <w:left w:w="80" w:type="dxa"/>
-              <w:bottom w:w="40" w:type="dxa"/>
-              <w:right w:w="80" w:type="dxa"/>
-            </w:tcMar>
-          </w:tcPr>
-          <w:p>
-            <w:pPr>
-              <w:pStyle w:val="TableText"/>
-            </w:pPr>
-            <w:r>
-              <w:rPr>
-                <w:sz w:val="19"/>
-              </w:rPr>
-              <w:t>B – Instructor material</w:t>
-            </w:r>
-          </w:p>
-        </w:tc>
-        <w:tc>
-          <w:tcPr>
-            <w:tcW w:type="dxa" w:w="6690"/>
-            <w:tcMar>
-              <w:top w:w="40" w:type="dxa"/>
-              <w:left w:w="80" w:type="dxa"/>
-              <w:bottom w:w="40" w:type="dxa"/>
-              <w:right w:w="80" w:type="dxa"/>
-            </w:tcMar>
-          </w:tcPr>
-          <w:p>
-            <w:pPr>
-              <w:pStyle w:val="TableText"/>
-            </w:pPr>
-            <w:r>
-              <w:rPr>
-                <w:sz w:val="19"/>
-              </w:rPr>
-              <w:t>Section 4 packages (examples, parameter nodes, model, meshes, launch and RViz files), later sections with ros2_control, MoveIt 2, application, Alexa and firmware [6].</w:t>
-            </w:r>
-          </w:p>
-        </w:tc>
-      </w:tr>
-      <w:tr>
-        <w:trPr>
-          <w:cantSplit/>
-        </w:trPr>
-        <w:tc>
-          <w:tcPr>
-            <w:tcW w:type="dxa" w:w="2381"/>
-            <w:tcMar>
-              <w:top w:w="40" w:type="dxa"/>
-              <w:left w:w="80" w:type="dxa"/>
-              <w:bottom w:w="40" w:type="dxa"/>
-              <w:right w:w="80" w:type="dxa"/>
-            </w:tcMar>
-          </w:tcPr>
-          <w:p>
-            <w:pPr>
-              <w:pStyle w:val="TableText"/>
-            </w:pPr>
-            <w:r>
-              <w:rPr>
-                <w:sz w:val="19"/>
-              </w:rPr>
-              <w:t>C – Assignment preparation</w:t>
-            </w:r>
-          </w:p>
-        </w:tc>
-        <w:tc>
-          <w:tcPr>
-            <w:tcW w:type="dxa" w:w="6690"/>
-            <w:tcMar>
-              <w:top w:w="40" w:type="dxa"/>
-              <w:left w:w="80" w:type="dxa"/>
-              <w:bottom w:w="40" w:type="dxa"/>
-              <w:right w:w="80" w:type="dxa"/>
-            </w:tcMar>
-          </w:tcPr>
-          <w:p>
-            <w:pPr>
-              <w:pStyle w:val="TableText"/>
-            </w:pPr>
-            <w:r>
-              <w:rPr>
-                <w:sz w:val="19"/>
-              </w:rPr>
-              <w:t>Clean workspace with corrections C1–C12; build, tests and runtime checks in an Ubuntu 22.04 / Humble container; parameter demonstration; TF and RViz verification; figures, documentation and this report [9].</w:t>
-            </w:r>
-          </w:p>
-        </w:tc>
-      </w:tr>
-      <w:tr>
-        <w:trPr>
-          <w:cantSplit/>
-        </w:trPr>
-        <w:tc>
-          <w:tcPr>
-            <w:tcW w:type="dxa" w:w="2381"/>
-            <w:tcMar>
-              <w:top w:w="40" w:type="dxa"/>
-              <w:left w:w="80" w:type="dxa"/>
-              <w:bottom w:w="40" w:type="dxa"/>
-              <w:right w:w="80" w:type="dxa"/>
-            </w:tcMar>
-          </w:tcPr>
-          <w:p>
-            <w:pPr>
-              <w:pStyle w:val="TableText"/>
-            </w:pPr>
-            <w:r>
-              <w:rPr>
-                <w:sz w:val="19"/>
-              </w:rPr>
-              <w:t>D – Future work (not documented in the notes)</w:t>
-            </w:r>
-          </w:p>
-        </w:tc>
-        <w:tc>
-          <w:tcPr>
-            <w:tcW w:type="dxa" w:w="6690"/>
-            <w:tcMar>
-              <w:top w:w="40" w:type="dxa"/>
-              <w:left w:w="80" w:type="dxa"/>
-              <w:bottom w:w="40" w:type="dxa"/>
-              <w:right w:w="80" w:type="dxa"/>
-            </w:tcMar>
-          </w:tcPr>
-          <w:p>
-            <w:pPr>
-              <w:pStyle w:val="TableText"/>
-            </w:pPr>
-            <w:r>
-              <w:rPr>
-                <w:sz w:val="19"/>
+                <w:sz w:val="18"/>
               </w:rPr>
               <w:t>Completing the Python parameter lab; C++ parameters; practical services and actions; the instructor's display launch on the student's machine; Gazebo simulation; ros2_control; MoveIt 2; the application and Alexa integration; building and wiring the physical robot.</w:t>
             </w:r>
@@ -13495,7 +13458,7 @@
         <w:jc w:val="both"/>
       </w:pPr>
       <w:r>
-        <w:t>The student's notes document installation, workspace and package creation, publishers and subscribers in both languages including both cross-language directions, and a complete robot model visualised in RViz; the parameter laboratory and all later course stages are not documented as completed. The prepared workspace preserves the instructor's robot model, adds twelve documented corrections, and was built and exercised in an Ubuntu 22.04 / ROS 2 Humble container. Its behaviour on the student's own machine, simulation, control, motion planning and hardware remain to be verified, and the model is a ten-times-scaled kinematic description with placeholder dynamics. Within these limits, the project shows that ROS 2's value lies less in any single feature than in the combination of standard interfaces, reusable components and inspection tools that allowed every step to be checked.</w:t>
+        <w:t>The notes document the work up to a complete robot model visualised in RViz; the parameter laboratory and later course stages are not documented as completed. The prepared workspace keeps the instructor's robot model, adds twelve documented corrections and was built and exercised in an Ubuntu 22.04 / ROS 2 Humble container; the student's own machine, simulation, control, motion planning and hardware remain to be verified, and the model is a ten-times-scaled kinematic description with placeholder dynamics. Within these limits, the project shows that ROS 2's value lies less in any single feature than in the combination of standard interfaces, reusable components and inspection tools that allowed every step to be checked.</w:t>
       </w:r>
     </w:p>
     <w:p>
@@ -13518,14 +13481,14 @@
       </w:pPr>
       <w:r>
         <w:rPr>
-          <w:sz w:val="20"/>
+          <w:sz w:val="18"/>
         </w:rPr>
         <w:t>Pages of the ROS 2 Humble documentation were read from the documentation source repository (ros2/ros2_documentation, branch humble, commit 35b00f1f3c1ab7c14bf85e35fa895f9f580ea279, inspected 28 Sep. 2026) because docs.ros.org was not reachable from the preparation environment; the URLs are those at which the same pages are published. References [1]–[5] are evidence of the student's course progress; the others support the technical content.</w:t>
       </w:r>
     </w:p>
     <w:p>
       <w:pPr>
-        <w:spacing w:after="20" w:line="240" w:lineRule="auto"/>
+        <w:spacing w:after="0" w:line="240" w:lineRule="auto"/>
         <w:ind w:left="567" w:hanging="567"/>
         <w:jc w:val="left"/>
       </w:pPr>
@@ -13553,7 +13516,7 @@
     </w:p>
     <w:p>
       <w:pPr>
-        <w:spacing w:after="20" w:line="240" w:lineRule="auto"/>
+        <w:spacing w:after="0" w:line="240" w:lineRule="auto"/>
         <w:ind w:left="567" w:hanging="567"/>
         <w:jc w:val="left"/>
       </w:pPr>
@@ -13568,7 +13531,7 @@
     </w:p>
     <w:p>
       <w:pPr>
-        <w:spacing w:after="20" w:line="240" w:lineRule="auto"/>
+        <w:spacing w:after="0" w:line="240" w:lineRule="auto"/>
         <w:ind w:left="567" w:hanging="567"/>
         <w:jc w:val="left"/>
       </w:pPr>
@@ -13583,7 +13546,7 @@
     </w:p>
     <w:p>
       <w:pPr>
-        <w:spacing w:after="20" w:line="240" w:lineRule="auto"/>
+        <w:spacing w:after="0" w:line="240" w:lineRule="auto"/>
         <w:ind w:left="567" w:hanging="567"/>
         <w:jc w:val="left"/>
       </w:pPr>
@@ -13598,7 +13561,7 @@
     </w:p>
     <w:p>
       <w:pPr>
-        <w:spacing w:after="20" w:line="240" w:lineRule="auto"/>
+        <w:spacing w:after="0" w:line="240" w:lineRule="auto"/>
         <w:ind w:left="567" w:hanging="567"/>
         <w:jc w:val="left"/>
       </w:pPr>
@@ -13613,7 +13576,7 @@
     </w:p>
     <w:p>
       <w:pPr>
-        <w:spacing w:after="20" w:line="240" w:lineRule="auto"/>
+        <w:spacing w:after="0" w:line="240" w:lineRule="auto"/>
         <w:ind w:left="567" w:hanging="567"/>
         <w:jc w:val="left"/>
       </w:pPr>
@@ -13628,7 +13591,7 @@
     </w:p>
     <w:p>
       <w:pPr>
-        <w:spacing w:after="20" w:line="240" w:lineRule="auto"/>
+        <w:spacing w:after="0" w:line="240" w:lineRule="auto"/>
         <w:ind w:left="567" w:hanging="567"/>
         <w:jc w:val="left"/>
       </w:pPr>
@@ -13656,7 +13619,7 @@
     </w:p>
     <w:p>
       <w:pPr>
-        <w:spacing w:after="20" w:line="240" w:lineRule="auto"/>
+        <w:spacing w:after="0" w:line="240" w:lineRule="auto"/>
         <w:ind w:left="567" w:hanging="567"/>
         <w:jc w:val="left"/>
       </w:pPr>
@@ -13684,7 +13647,7 @@
     </w:p>
     <w:p>
       <w:pPr>
-        <w:spacing w:after="20" w:line="240" w:lineRule="auto"/>
+        <w:spacing w:after="0" w:line="240" w:lineRule="auto"/>
         <w:ind w:left="567" w:hanging="567"/>
         <w:jc w:val="left"/>
       </w:pPr>
@@ -13738,7 +13701,7 @@
     </w:p>
     <w:p>
       <w:pPr>
-        <w:spacing w:after="20" w:line="240" w:lineRule="auto"/>
+        <w:spacing w:after="0" w:line="240" w:lineRule="auto"/>
         <w:ind w:left="567" w:hanging="567"/>
         <w:jc w:val="left"/>
       </w:pPr>
@@ -13766,7 +13729,7 @@
     </w:p>
     <w:p>
       <w:pPr>
-        <w:spacing w:after="20" w:line="240" w:lineRule="auto"/>
+        <w:spacing w:after="0" w:line="240" w:lineRule="auto"/>
         <w:ind w:left="567" w:hanging="567"/>
         <w:jc w:val="left"/>
       </w:pPr>
@@ -13794,7 +13757,7 @@
     </w:p>
     <w:p>
       <w:pPr>
-        <w:spacing w:after="20" w:line="240" w:lineRule="auto"/>
+        <w:spacing w:after="0" w:line="240" w:lineRule="auto"/>
         <w:ind w:left="567" w:hanging="567"/>
         <w:jc w:val="left"/>
       </w:pPr>
@@ -13822,7 +13785,7 @@
     </w:p>
     <w:p>
       <w:pPr>
-        <w:spacing w:after="20" w:line="240" w:lineRule="auto"/>
+        <w:spacing w:after="0" w:line="240" w:lineRule="auto"/>
         <w:ind w:left="567" w:hanging="567"/>
         <w:jc w:val="left"/>
       </w:pPr>
@@ -13850,7 +13813,7 @@
     </w:p>
     <w:p>
       <w:pPr>
-        <w:spacing w:after="20" w:line="240" w:lineRule="auto"/>
+        <w:spacing w:after="0" w:line="240" w:lineRule="auto"/>
         <w:ind w:left="567" w:hanging="567"/>
         <w:jc w:val="left"/>
       </w:pPr>
@@ -13878,7 +13841,7 @@
     </w:p>
     <w:p>
       <w:pPr>
-        <w:spacing w:after="20" w:line="240" w:lineRule="auto"/>
+        <w:spacing w:after="0" w:line="240" w:lineRule="auto"/>
         <w:ind w:left="567" w:hanging="567"/>
         <w:jc w:val="left"/>
       </w:pPr>
@@ -13906,7 +13869,7 @@
     </w:p>
     <w:p>
       <w:pPr>
-        <w:spacing w:after="20" w:line="240" w:lineRule="auto"/>
+        <w:spacing w:after="0" w:line="240" w:lineRule="auto"/>
         <w:ind w:left="567" w:hanging="567"/>
         <w:jc w:val="left"/>
       </w:pPr>
@@ -13934,7 +13897,7 @@
     </w:p>
     <w:p>
       <w:pPr>
-        <w:spacing w:after="20" w:line="240" w:lineRule="auto"/>
+        <w:spacing w:after="0" w:line="240" w:lineRule="auto"/>
         <w:ind w:left="567" w:hanging="567"/>
         <w:jc w:val="left"/>
       </w:pPr>
@@ -13962,7 +13925,7 @@
     </w:p>
     <w:p>
       <w:pPr>
-        <w:spacing w:after="20" w:line="240" w:lineRule="auto"/>
+        <w:spacing w:after="0" w:line="240" w:lineRule="auto"/>
         <w:ind w:left="567" w:hanging="567"/>
         <w:jc w:val="left"/>
       </w:pPr>
@@ -13990,7 +13953,7 @@
     </w:p>
     <w:p>
       <w:pPr>
-        <w:spacing w:after="20" w:line="240" w:lineRule="auto"/>
+        <w:spacing w:after="0" w:line="240" w:lineRule="auto"/>
         <w:ind w:left="567" w:hanging="567"/>
         <w:jc w:val="left"/>
       </w:pPr>
@@ -14018,7 +13981,7 @@
     </w:p>
     <w:p>
       <w:pPr>
-        <w:spacing w:after="20" w:line="240" w:lineRule="auto"/>
+        <w:spacing w:after="0" w:line="240" w:lineRule="auto"/>
         <w:ind w:left="567" w:hanging="567"/>
         <w:jc w:val="left"/>
       </w:pPr>
@@ -14046,7 +14009,7 @@
     </w:p>
     <w:p>
       <w:pPr>
-        <w:spacing w:after="20" w:line="240" w:lineRule="auto"/>
+        <w:spacing w:after="0" w:line="240" w:lineRule="auto"/>
         <w:ind w:left="567" w:hanging="567"/>
         <w:jc w:val="left"/>
       </w:pPr>
@@ -14074,7 +14037,7 @@
     </w:p>
     <w:p>
       <w:pPr>
-        <w:spacing w:after="20" w:line="240" w:lineRule="auto"/>
+        <w:spacing w:after="0" w:line="240" w:lineRule="auto"/>
         <w:ind w:left="567" w:hanging="567"/>
         <w:jc w:val="left"/>
       </w:pPr>
@@ -14102,7 +14065,7 @@
     </w:p>
     <w:p>
       <w:pPr>
-        <w:spacing w:after="20" w:line="240" w:lineRule="auto"/>
+        <w:spacing w:after="0" w:line="240" w:lineRule="auto"/>
         <w:ind w:left="567" w:hanging="567"/>
         <w:jc w:val="left"/>
       </w:pPr>
@@ -14130,7 +14093,7 @@
     </w:p>
     <w:p>
       <w:pPr>
-        <w:spacing w:after="20" w:line="240" w:lineRule="auto"/>
+        <w:spacing w:after="0" w:line="240" w:lineRule="auto"/>
         <w:ind w:left="567" w:hanging="567"/>
         <w:jc w:val="left"/>
       </w:pPr>
@@ -14158,7 +14121,7 @@
     </w:p>
     <w:p>
       <w:pPr>
-        <w:spacing w:after="20" w:line="240" w:lineRule="auto"/>
+        <w:spacing w:after="0" w:line="240" w:lineRule="auto"/>
         <w:ind w:left="567" w:hanging="567"/>
         <w:jc w:val="left"/>
       </w:pPr>
@@ -14186,7 +14149,7 @@
     </w:p>
     <w:p>
       <w:pPr>
-        <w:spacing w:after="20" w:line="240" w:lineRule="auto"/>
+        <w:spacing w:after="0" w:line="240" w:lineRule="auto"/>
         <w:ind w:left="567" w:hanging="567"/>
         <w:jc w:val="left"/>
       </w:pPr>
@@ -14214,7 +14177,7 @@
     </w:p>
     <w:p>
       <w:pPr>
-        <w:spacing w:after="20" w:line="240" w:lineRule="auto"/>
+        <w:spacing w:after="0" w:line="240" w:lineRule="auto"/>
         <w:ind w:left="567" w:hanging="567"/>
         <w:jc w:val="left"/>
       </w:pPr>
@@ -14242,7 +14205,7 @@
     </w:p>
     <w:p>
       <w:pPr>
-        <w:spacing w:after="20" w:line="240" w:lineRule="auto"/>
+        <w:spacing w:after="0" w:line="240" w:lineRule="auto"/>
         <w:ind w:left="567" w:hanging="567"/>
         <w:jc w:val="left"/>
       </w:pPr>
@@ -14270,7 +14233,7 @@
     </w:p>
     <w:p>
       <w:pPr>
-        <w:spacing w:after="20" w:line="240" w:lineRule="auto"/>
+        <w:spacing w:after="0" w:line="240" w:lineRule="auto"/>
         <w:ind w:left="567" w:hanging="567"/>
         <w:jc w:val="left"/>
       </w:pPr>
@@ -14298,7 +14261,7 @@
     </w:p>
     <w:p>
       <w:pPr>
-        <w:spacing w:after="20" w:line="240" w:lineRule="auto"/>
+        <w:spacing w:after="0" w:line="240" w:lineRule="auto"/>
         <w:ind w:left="567" w:hanging="567"/>
         <w:jc w:val="left"/>
       </w:pPr>
@@ -14326,7 +14289,7 @@
     </w:p>
     <w:p>
       <w:pPr>
-        <w:spacing w:after="20" w:line="240" w:lineRule="auto"/>
+        <w:spacing w:after="0" w:line="240" w:lineRule="auto"/>
         <w:ind w:left="567" w:hanging="567"/>
         <w:jc w:val="left"/>
       </w:pPr>
@@ -14354,7 +14317,7 @@
     </w:p>
     <w:p>
       <w:pPr>
-        <w:spacing w:after="20" w:line="240" w:lineRule="auto"/>
+        <w:spacing w:after="0" w:line="240" w:lineRule="auto"/>
         <w:ind w:left="567" w:hanging="567"/>
         <w:jc w:val="left"/>
       </w:pPr>
@@ -14382,7 +14345,7 @@
     </w:p>
     <w:p>
       <w:pPr>
-        <w:spacing w:after="20" w:line="240" w:lineRule="auto"/>
+        <w:spacing w:after="0" w:line="240" w:lineRule="auto"/>
         <w:ind w:left="567" w:hanging="567"/>
         <w:jc w:val="left"/>
       </w:pPr>
@@ -14410,7 +14373,7 @@
     </w:p>
     <w:p>
       <w:pPr>
-        <w:spacing w:after="20" w:line="240" w:lineRule="auto"/>
+        <w:spacing w:after="0" w:line="240" w:lineRule="auto"/>
         <w:ind w:left="567" w:hanging="567"/>
         <w:jc w:val="left"/>
       </w:pPr>
@@ -14438,7 +14401,7 @@
     </w:p>
     <w:p>
       <w:pPr>
-        <w:spacing w:after="20" w:line="240" w:lineRule="auto"/>
+        <w:spacing w:after="0" w:line="240" w:lineRule="auto"/>
         <w:ind w:left="567" w:hanging="567"/>
         <w:jc w:val="left"/>
       </w:pPr>
@@ -14466,7 +14429,7 @@
     </w:p>
     <w:p>
       <w:pPr>
-        <w:spacing w:after="20" w:line="240" w:lineRule="auto"/>
+        <w:spacing w:after="0" w:line="240" w:lineRule="auto"/>
         <w:ind w:left="567" w:hanging="567"/>
         <w:jc w:val="left"/>
       </w:pPr>
@@ -14494,7 +14457,7 @@
     </w:p>
     <w:p>
       <w:pPr>
-        <w:spacing w:after="20" w:line="240" w:lineRule="auto"/>
+        <w:spacing w:after="0" w:line="240" w:lineRule="auto"/>
         <w:ind w:left="567" w:hanging="567"/>
         <w:jc w:val="left"/>
       </w:pPr>
@@ -14522,7 +14485,7 @@
     </w:p>
     <w:p>
       <w:pPr>
-        <w:spacing w:after="20" w:line="240" w:lineRule="auto"/>
+        <w:spacing w:after="0" w:line="240" w:lineRule="auto"/>
         <w:ind w:left="567" w:hanging="567"/>
         <w:jc w:val="left"/>
       </w:pPr>
@@ -14550,7 +14513,7 @@
     </w:p>
     <w:p>
       <w:pPr>
-        <w:spacing w:after="20" w:line="240" w:lineRule="auto"/>
+        <w:spacing w:after="0" w:line="240" w:lineRule="auto"/>
         <w:ind w:left="567" w:hanging="567"/>
         <w:jc w:val="left"/>
       </w:pPr>
@@ -14578,7 +14541,7 @@
     </w:p>
     <w:p>
       <w:pPr>
-        <w:spacing w:after="20" w:line="240" w:lineRule="auto"/>
+        <w:spacing w:after="0" w:line="240" w:lineRule="auto"/>
         <w:ind w:left="567" w:hanging="567"/>
         <w:jc w:val="left"/>
       </w:pPr>
@@ -14606,7 +14569,7 @@
     </w:p>
     <w:p>
       <w:pPr>
-        <w:spacing w:after="20" w:line="240" w:lineRule="auto"/>
+        <w:spacing w:after="0" w:line="240" w:lineRule="auto"/>
         <w:ind w:left="567" w:hanging="567"/>
         <w:jc w:val="left"/>
       </w:pPr>
@@ -14634,7 +14597,7 @@
     </w:p>
     <w:p>
       <w:pPr>
-        <w:spacing w:after="20" w:line="240" w:lineRule="auto"/>
+        <w:spacing w:after="0" w:line="240" w:lineRule="auto"/>
         <w:ind w:left="567" w:hanging="567"/>
         <w:jc w:val="left"/>
       </w:pPr>
@@ -14662,7 +14625,7 @@
     </w:p>
     <w:p>
       <w:pPr>
-        <w:spacing w:after="20" w:line="240" w:lineRule="auto"/>
+        <w:spacing w:after="0" w:line="240" w:lineRule="auto"/>
         <w:ind w:left="567" w:hanging="567"/>
         <w:jc w:val="left"/>
       </w:pPr>
@@ -14690,7 +14653,7 @@
     </w:p>
     <w:p>
       <w:pPr>
-        <w:spacing w:after="20" w:line="240" w:lineRule="auto"/>
+        <w:spacing w:after="0" w:line="240" w:lineRule="auto"/>
         <w:ind w:left="567" w:hanging="567"/>
         <w:jc w:val="left"/>
       </w:pPr>
@@ -14718,7 +14681,7 @@
     </w:p>
     <w:p>
       <w:pPr>
-        <w:spacing w:after="20" w:line="240" w:lineRule="auto"/>
+        <w:spacing w:after="0" w:line="240" w:lineRule="auto"/>
         <w:ind w:left="567" w:hanging="567"/>
         <w:jc w:val="left"/>
       </w:pPr>
@@ -14746,7 +14709,7 @@
     </w:p>
     <w:p>
       <w:pPr>
-        <w:spacing w:after="20" w:line="240" w:lineRule="auto"/>
+        <w:spacing w:after="0" w:line="240" w:lineRule="auto"/>
         <w:ind w:left="567" w:hanging="567"/>
         <w:jc w:val="left"/>
       </w:pPr>
@@ -14774,7 +14737,7 @@
     </w:p>
     <w:p>
       <w:pPr>
-        <w:spacing w:after="20" w:line="240" w:lineRule="auto"/>
+        <w:spacing w:after="0" w:line="240" w:lineRule="auto"/>
         <w:ind w:left="567" w:hanging="567"/>
         <w:jc w:val="left"/>
       </w:pPr>
@@ -14798,6 +14761,21 @@
           <w:sz w:val="18"/>
         </w:rPr>
         <w:t>. [Online]. Available: https://docs.ros.org/en/humble/Tutorials/Beginner-CLI-Tools/Understanding-ROS2-Parameters/Understanding-ROS2-Parameters.html</w:t>
+      </w:r>
+    </w:p>
+    <w:p>
+      <w:pPr>
+        <w:spacing w:after="0" w:line="240" w:lineRule="auto"/>
+        <w:ind w:left="567" w:hanging="567"/>
+        <w:jc w:val="left"/>
+      </w:pPr>
+      <w:r>
+        <w:rPr>
+          <w:sz w:val="18"/>
+        </w:rPr>
+        <w:t>[48]</w:t>
+        <w:tab/>
+        <w:t>A. Brandi, "Robotics-and-ROS-2-Learn-by-Doing-Manipulators," GitHub repository, branch gz-classic, commit 07440a5f771b6fcc6c6f4a0b2ff6d40e4eb6ccb2, retrieved 28 Sep. 2026 (used for comparison only).</w:t>
       </w:r>
     </w:p>
     <w:sectPr>
@@ -14819,7 +14797,9 @@
     <w:pPr>
       <w:pStyle w:val="Footer"/>
       <w:tabs>
+        <w:tab w:val="clear" w:pos="4680"/>
         <w:tab w:val="right" w:pos="9070"/>
+        <w:tab w:val="clear" w:pos="9360"/>
       </w:tabs>
     </w:pPr>
     <w:r/>
@@ -27044,7 +27024,7 @@
     <w:pPr>
       <w:shd w:val="clear" w:color="auto" w:fill="F3F5F7"/>
       <w:spacing w:line="240" w:lineRule="auto" w:after="0" w:before="0"/>
-      <w:ind w:left="113"/>
+      <w:ind w:left="680" w:hanging="567"/>
     </w:pPr>
     <w:rPr>
       <w:rFonts w:ascii="Courier New" w:hAnsi="Courier New" w:cs="Courier New" w:eastAsia="Courier New"/>

</xml_diff>

<commit_message>
Apply report cross-check corrections; verify gui:=false; final archive
- Report: corrections from an independent claim-by-claim cross-check
  (Table 1 motivation sources, notes vs documentation scope, parameter
  lab wording, UTC dates, unused meshes listed, exact tf quotation,
  description package contents, Gazebo launch changes, which checks
  were scripted, rosdep wording); references at 8.5 pt; 25 pages
- Verification: new stage 55 launches display.launch.py gui:=false
  (run_2026-09-28_gui_false, V26); V25 re-run on the final archive
- README and completion gate updated; source archive regenerated

Co-Authored-By: Claude Opus 5.5 <noreply@anthropic.com>
Claude-Session: https://claude.ai/code/session_01HT8zHL81wrYxCu5VbARJow
</commit_message>
<xml_diff>
--- a/ros2_manipulator_assignment/report/Robot_Operating_System_2_Manipulator_Report.docx
+++ b/ros2_manipulator_assignment/report/Robot_Operating_System_2_Manipulator_Report.docx
@@ -239,7 +239,7 @@
         <w:jc w:val="both"/>
       </w:pPr>
       <w:r>
-        <w:t>A clean workspace with three packages was prepared and twelve small, documented corrections were made, concerning the timer period, clean shutdown, parameter validation, dependency declarations and a stale RViz configuration. The unchanged robot model and the corrected examples were built and exercised in an Ubuntu 22.04 / ROS 2 Humble container: Python-to-C++ and C++-to-Python publisher–subscriber communication, parameter inspection and updates including the rejection of invalid updates, URDF processing, joint states, TF and an RViz display rendered on a virtual screen. The notes document the installation, workspace creation, publishers and subscribers in both languages and a complete URDF model visualised in RViz; the parameter laboratory is documented only as a code listing.</w:t>
+        <w:t>A clean workspace with three packages was prepared and twelve small, documented corrections were made, concerning the timer period, clean shutdown, parameter validation, dependency declarations and a stale RViz configuration. The unchanged robot model and the corrected examples were built and exercised in an Ubuntu 22.04 / ROS 2 Humble container: Python-to-C++ and C++-to-Python publisher–subscriber communication, parameter inspection and updates including the rejection of invalid updates, URDF processing, joint states, TF and an RViz display rendered on a virtual screen. The notes document the installation, workspace creation, publishers and subscribers in both languages and a complete URDF model visualised in RViz; the parameter laboratory is documented only by the creation of the file and a code listing.</w:t>
       </w:r>
     </w:p>
     <w:p>
@@ -807,7 +807,7 @@
           <w:tab/>
         </w:r>
         <w:r>
-          <w:t xml:space="preserve">19</w:t>
+          <w:t xml:space="preserve">18</w:t>
         </w:r>
       </w:hyperlink>
     </w:p>
@@ -902,7 +902,7 @@
           <w:tab/>
         </w:r>
         <w:r>
-          <w:t xml:space="preserve">21</w:t>
+          <w:t xml:space="preserve">20</w:t>
         </w:r>
       </w:hyperlink>
     </w:p>
@@ -1218,7 +1218,7 @@
         <w:t>distributions</w:t>
       </w:r>
       <w:r>
-        <w:t>, versioned sets of packages kept stable after release [15]. Humble Hawksbill, the eighth ROS 2 release, was published on 23 May 2022 and reaches end of life in May 2027 [8], [15]. The notes record these ideas as conceptual study, including that ROS is a framework on top of an operating system (1.2 Course Notes, lessons 16, 17 and 20) [2].</w:t>
+        <w:t>, versioned sets of packages kept stable after release [15]. Humble Hawksbill, the eighth ROS 2 release, was published on 23 May 2022 and reaches end of life in May 2027 [8], [15]. The notes record, as conceptual study, that ROS is a common software framework running on top of an operating system (1.2 Course Notes, lessons 16, 17 and 20) [2]; distributions and release dates are taken from the documentation only.</w:t>
       </w:r>
     </w:p>
     <w:p>
@@ -1262,7 +1262,7 @@
         <w:fldChar w:fldCharType="end"/>
       </w:r>
       <w:r>
-        <w:t xml:space="preserve"> relates these motivations to what the Humble documentation actually provides and qualifies each point, because several of them are capabilities that must be configured rather than guarantees.</w:t>
+        <w:t xml:space="preserve"> relates four of them (embedded platforms are outside this project), together with the multi-language design described in lesson 19, to what the Humble documentation actually provides and qualifies each point, because several of them are capabilities that must be configured rather than guarantees.</w:t>
       </w:r>
     </w:p>
     <w:p>
@@ -1360,7 +1360,7 @@
                 <w:b/>
                 <w:sz w:val="19"/>
               </w:rPr>
-              <w:t>Motivation (notes, lesson 18)</w:t>
+              <w:t>Motivation (notes)</w:t>
             </w:r>
           </w:p>
         </w:tc>
@@ -1719,7 +1719,7 @@
               <w:rPr>
                 <w:sz w:val="19"/>
               </w:rPr>
-              <w:t>Several programming languages</w:t>
+              <w:t>Several programming languages (lesson 19)</w:t>
             </w:r>
           </w:p>
         </w:tc>
@@ -3561,7 +3561,17 @@
         <w:fldChar w:fldCharType="end"/>
       </w:r>
       <w:r>
-        <w:t>); this correction is category C. The same code appears unchanged in the student's notes (1.3 Course Notes, lesson 26, p28–p29) [3].</w:t>
+        <w:t xml:space="preserve">); this correction is category C. The instructor's original, which passes </w:t>
+      </w:r>
+      <w:r>
+        <w:rPr>
+          <w:rFonts w:ascii="Courier New" w:hAnsi="Courier New" w:cs="Courier New" w:eastAsia="Courier New"/>
+          <w:sz w:val="21"/>
+        </w:rPr>
+        <w:t>frequency_</w:t>
+      </w:r>
+      <w:r>
+        <w:t xml:space="preserve"> directly as the period, appears unchanged in the student's notes (1.3 Course Notes, lesson 26, p28–p29) [3].</w:t>
       </w:r>
     </w:p>
     <w:p>
@@ -4518,7 +4528,7 @@
         <w:jc w:val="both"/>
       </w:pPr>
       <w:r>
-        <w:t xml:space="preserve">The student's notes contain historical evidence of the same two directions on the student's virtual machine, dated 25 June 2026 by the VM clock: a C++ publisher feeding the Python subscriber (1.4, lesson 28, p22, screenshot IMG020) and the Python publisher feeding the C++ subscriber (1.4, lesson 29, p41–p42, IMG031–IMG032). The notes also show </w:t>
+        <w:t xml:space="preserve">The student's notes contain historical evidence of the same two directions on the student's virtual machine, dated 25 June 2026 (UTC, from the ROS log time stamps of the VM clock): a C++ publisher feeding the Python subscriber (1.4, lesson 28, p22, screenshot IMG020) and the Python publisher feeding the C++ subscriber (1.4, lesson 29, p41–p42, IMG031–IMG032). The notes also show </w:t>
       </w:r>
       <w:r>
         <w:rPr>
@@ -5671,8 +5681,8 @@
         <w:tblLook w:firstColumn="1" w:firstRow="1" w:lastColumn="0" w:lastRow="0" w:noHBand="0" w:noVBand="1" w:val="04A0"/>
       </w:tblPr>
       <w:tblGrid>
-        <w:gridCol w:w="4477"/>
-        <w:gridCol w:w="4593"/>
+        <w:gridCol w:w="4535"/>
+        <w:gridCol w:w="4535"/>
       </w:tblGrid>
       <w:tr>
         <w:trPr>
@@ -5680,7 +5690,7 @@
         </w:trPr>
         <w:tc>
           <w:tcPr>
-            <w:tcW w:type="dxa" w:w="4477"/>
+            <w:tcW w:type="dxa" w:w="4535"/>
             <w:vAlign w:val="bottom"/>
           </w:tcPr>
           <w:p>
@@ -5692,7 +5702,7 @@
             <w:r>
               <w:drawing>
                 <wp:inline xmlns:a="http://schemas.openxmlformats.org/drawingml/2006/main" xmlns:pic="http://schemas.openxmlformats.org/drawingml/2006/picture">
-                  <wp:extent cx="2664000" cy="3436319"/>
+                  <wp:extent cx="2520000" cy="3250572"/>
                   <wp:docPr id="4" name="Picture 4"/>
                   <wp:cNvGraphicFramePr>
                     <a:graphicFrameLocks noChangeAspect="1"/>
@@ -5713,7 +5723,7 @@
                         <pic:spPr>
                           <a:xfrm>
                             <a:off x="0" y="0"/>
-                            <a:ext cx="2664000" cy="3436319"/>
+                            <a:ext cx="2520000" cy="3250572"/>
                           </a:xfrm>
                           <a:prstGeom prst="rect"/>
                         </pic:spPr>
@@ -5859,7 +5869,7 @@
         </w:tc>
         <w:tc>
           <w:tcPr>
-            <w:tcW w:type="dxa" w:w="4594"/>
+            <w:tcW w:type="dxa" w:w="4535"/>
             <w:vAlign w:val="bottom"/>
           </w:tcPr>
           <w:p>
@@ -5871,7 +5881,7 @@
             <w:r>
               <w:drawing>
                 <wp:inline xmlns:a="http://schemas.openxmlformats.org/drawingml/2006/main" xmlns:pic="http://schemas.openxmlformats.org/drawingml/2006/picture">
-                  <wp:extent cx="2736000" cy="2790227"/>
+                  <wp:extent cx="2520000" cy="2569946"/>
                   <wp:docPr id="5" name="Picture 5"/>
                   <wp:cNvGraphicFramePr>
                     <a:graphicFrameLocks noChangeAspect="1"/>
@@ -5892,7 +5902,7 @@
                         <pic:spPr>
                           <a:xfrm>
                             <a:off x="0" y="0"/>
-                            <a:ext cx="2736000" cy="2790227"/>
+                            <a:ext cx="2520000" cy="2569946"/>
                           </a:xfrm>
                           <a:prstGeom prst="rect"/>
                         </pic:spPr>
@@ -7845,7 +7855,67 @@
         <w:t>/joint_states</w:t>
       </w:r>
       <w:r>
-        <w:t xml:space="preserve"> [9]. The physical robot of the course uses a parallelogram linkage to keep the gripper orientation (notes, lesson 5) [1]; the URDF does not model that linkage and treats the arm as a serial chain, and six supplied meshes of linkage parts are unused.</w:t>
+        <w:t xml:space="preserve"> [9]. The physical robot of the course uses a parallelogram linkage to keep the gripper orientation (notes, lesson 5) [1]; the URDF does not model that linkage and treats the arm as a serial chain; six of the 13 supplied meshes (</w:t>
+      </w:r>
+      <w:r>
+        <w:rPr>
+          <w:rFonts w:ascii="Courier New" w:hAnsi="Courier New" w:cs="Courier New" w:eastAsia="Courier New"/>
+          <w:sz w:val="21"/>
+        </w:rPr>
+        <w:t>link</w:t>
+      </w:r>
+      <w:r>
+        <w:t xml:space="preserve">, </w:t>
+      </w:r>
+      <w:r>
+        <w:rPr>
+          <w:rFonts w:ascii="Courier New" w:hAnsi="Courier New" w:cs="Courier New" w:eastAsia="Courier New"/>
+          <w:sz w:val="21"/>
+        </w:rPr>
+        <w:t>plate</w:t>
+      </w:r>
+      <w:r>
+        <w:t xml:space="preserve">, </w:t>
+      </w:r>
+      <w:r>
+        <w:rPr>
+          <w:rFonts w:ascii="Courier New" w:hAnsi="Courier New" w:cs="Courier New" w:eastAsia="Courier New"/>
+          <w:sz w:val="21"/>
+        </w:rPr>
+        <w:t>round_plate</w:t>
+      </w:r>
+      <w:r>
+        <w:t xml:space="preserve">, </w:t>
+      </w:r>
+      <w:r>
+        <w:rPr>
+          <w:rFonts w:ascii="Courier New" w:hAnsi="Courier New" w:cs="Courier New" w:eastAsia="Courier New"/>
+          <w:sz w:val="21"/>
+        </w:rPr>
+        <w:t>servo_plate</w:t>
+      </w:r>
+      <w:r>
+        <w:t xml:space="preserve">, </w:t>
+      </w:r>
+      <w:r>
+        <w:rPr>
+          <w:rFonts w:ascii="Courier New" w:hAnsi="Courier New" w:cs="Courier New" w:eastAsia="Courier New"/>
+          <w:sz w:val="21"/>
+        </w:rPr>
+        <w:t>triangular_link</w:t>
+      </w:r>
+      <w:r>
+        <w:t xml:space="preserve">, </w:t>
+      </w:r>
+      <w:r>
+        <w:rPr>
+          <w:rFonts w:ascii="Courier New" w:hAnsi="Courier New" w:cs="Courier New" w:eastAsia="Courier New"/>
+          <w:sz w:val="21"/>
+        </w:rPr>
+        <w:t>vertical_drive_arm</w:t>
+      </w:r>
+      <w:r>
+        <w:t>) are not referenced by the model.</w:t>
       </w:r>
     </w:p>
     <w:p>
@@ -7893,7 +7963,7 @@
         <w:t>/joint_states</w:t>
       </w:r>
       <w:r>
-        <w:t xml:space="preserve"> [43]. Joint positions come from joint_state_publisher or its GUI, which parse the model, publish values for all non-fixed joints and let robot_state_publisher "calculate all of the transforms" [41]. </w:t>
+        <w:t xml:space="preserve"> [43]. Joint positions come from joint_state_publisher or its GUI, which parse the model, publish values for all non-fixed joints and let robot_state_publisher "calculate all of transforms between the different parts" [41]. </w:t>
       </w:r>
       <w:r>
         <w:fldChar w:fldCharType="begin"/>
@@ -8397,7 +8467,7 @@
       <w:r>
         <w:drawing>
           <wp:inline xmlns:a="http://schemas.openxmlformats.org/drawingml/2006/main" xmlns:pic="http://schemas.openxmlformats.org/drawingml/2006/picture">
-            <wp:extent cx="4860000" cy="2935612"/>
+            <wp:extent cx="4500000" cy="2718159"/>
             <wp:docPr id="8" name="Picture 8"/>
             <wp:cNvGraphicFramePr>
               <a:graphicFrameLocks noChangeAspect="1"/>
@@ -8418,7 +8488,7 @@
                   <pic:spPr>
                     <a:xfrm>
                       <a:off x="0" y="0"/>
-                      <a:ext cx="4860000" cy="2935612"/>
+                      <a:ext cx="4500000" cy="2718159"/>
                     </a:xfrm>
                     <a:prstGeom prst="rect"/>
                   </pic:spPr>
@@ -10089,7 +10159,17 @@
         <w:jc w:val="both"/>
       </w:pPr>
       <w:r>
-        <w:t>The course robot is a 3D-printable desktop arm with three joints – base, shoulder and elbow – plus a gripper, driven by four hobby servo motors ("typically 4 × SG90") through an Arduino board (1.1 Course Notes, lesson 5, p5–p7) [1]. In software the robot is represented by the arduinobot_description package; the two example packages teach the communication and configuration mechanisms that later course sections use to control it. Responsibilities are deliberately separated: the description package contains no program code, only the model, its meshes, a launch file and an RViz configuration, while all running programs in the visualisation are generic Humble nodes.</w:t>
+        <w:t xml:space="preserve">The course robot is a 3D-printable desktop arm with three joints – base, shoulder and elbow – plus a gripper, driven by four hobby servo motors ("typically 4 × SG90") through an Arduino board (1.1 Course Notes, lesson 5, p5–p7) [1]. In software the robot is represented by the arduinobot_description package; the two example packages teach the communication and configuration mechanisms that later course sections use to control it. Responsibilities are deliberately separated: the description package contains no program code, only the model, its meshes, two launch files (display and the optional Gazebo launch), an RViz configuration and the instructor's </w:t>
+      </w:r>
+      <w:r>
+        <w:rPr>
+          <w:rFonts w:ascii="Courier New" w:hAnsi="Courier New" w:cs="Courier New" w:eastAsia="Courier New"/>
+          <w:sz w:val="21"/>
+        </w:rPr>
+        <w:t>arduinobot.pdf</w:t>
+      </w:r>
+      <w:r>
+        <w:t xml:space="preserve"> diagram, while all running programs in the visualisation are generic Humble nodes.</w:t>
       </w:r>
     </w:p>
     <w:p>
@@ -10262,7 +10342,7 @@
         <w:t>gazebo.launch.py</w:t>
       </w:r>
       <w:r>
-        <w:t xml:space="preserve"> was kept as instructor material with formatting fixes only. It was not executed, and on Humble its use of </w:t>
+        <w:t xml:space="preserve"> was kept as instructor material with lint-only fixes (bracket formatting, an unused variable removed). It was not executed, and on Humble its use of </w:t>
       </w:r>
       <w:r>
         <w:rPr>
@@ -11681,7 +11761,7 @@
         <w:fldChar w:fldCharType="end"/>
       </w:r>
       <w:r>
-        <w:t>: inspect the sources, prepare the packages, resolve dependencies, build, source, run, inspect and document, returning to preparation when a check revealed a defect. Every check was scripted (</w:t>
+        <w:t>: inspect the sources, prepare the packages, resolve dependencies, build, source, run, inspect and document, returning to preparation when a check revealed a defect. The build, messaging, parameter, model/TF and RViz checks were scripted (</w:t>
       </w:r>
       <w:r>
         <w:rPr>
@@ -11691,7 +11771,17 @@
         <w:t>verification/scripts/</w:t>
       </w:r>
       <w:r>
-        <w:t>), so that it can be repeated on the target machine and its output kept as evidence.</w:t>
+        <w:t xml:space="preserve">) so that they can be repeated on the target machine and their output kept as evidence; the few checks run by hand are recorded with their commands in </w:t>
+      </w:r>
+      <w:r>
+        <w:rPr>
+          <w:rFonts w:ascii="Courier New" w:hAnsi="Courier New" w:cs="Courier New" w:eastAsia="Courier New"/>
+          <w:sz w:val="21"/>
+        </w:rPr>
+        <w:t>docs/VERIFICATION.md</w:t>
+      </w:r>
+      <w:r>
+        <w:t>.</w:t>
       </w:r>
     </w:p>
     <w:p>
@@ -11703,7 +11793,7 @@
       <w:r>
         <w:drawing>
           <wp:inline xmlns:a="http://schemas.openxmlformats.org/drawingml/2006/main" xmlns:pic="http://schemas.openxmlformats.org/drawingml/2006/picture">
-            <wp:extent cx="4860000" cy="2078692"/>
+            <wp:extent cx="4500000" cy="1924715"/>
             <wp:docPr id="11" name="Picture 11"/>
             <wp:cNvGraphicFramePr>
               <a:graphicFrameLocks noChangeAspect="1"/>
@@ -11724,7 +11814,7 @@
                   <pic:spPr>
                     <a:xfrm>
                       <a:off x="0" y="0"/>
-                      <a:ext cx="4860000" cy="2078692"/>
+                      <a:ext cx="4500000" cy="1924715"/>
                     </a:xfrm>
                     <a:prstGeom prst="rect"/>
                   </pic:spPr>
@@ -12654,7 +12744,20 @@
               <w:rPr>
                 <w:sz w:val="18"/>
               </w:rPr>
-              <w:t>RViz display, late join, clean shutdown</w:t>
+              <w:t>RViz display (</w:t>
+            </w:r>
+            <w:r>
+              <w:rPr>
+                <w:rFonts w:ascii="Courier New" w:hAnsi="Courier New" w:cs="Courier New" w:eastAsia="Courier New"/>
+                <w:sz w:val="15"/>
+              </w:rPr>
+              <w:t>gui</w:t>
+            </w:r>
+            <w:r>
+              <w:rPr>
+                <w:sz w:val="18"/>
+              </w:rPr>
+              <w:t xml:space="preserve"> true and false), late join, clean shutdown</w:t>
             </w:r>
           </w:p>
         </w:tc>
@@ -12910,7 +13013,17 @@
         <w:t>Configuration without recompilation.</w:t>
       </w:r>
       <w:r>
-        <w:t xml:space="preserve"> Parameters changed node behaviour at start-up and at run time, and launch arguments selected the joint-state source.</w:t>
+        <w:t xml:space="preserve"> Parameters changed node behaviour at start-up and at run time, and the </w:t>
+      </w:r>
+      <w:r>
+        <w:rPr>
+          <w:rFonts w:ascii="Courier New" w:hAnsi="Courier New" w:cs="Courier New" w:eastAsia="Courier New"/>
+          <w:sz w:val="21"/>
+        </w:rPr>
+        <w:t>gui</w:t>
+      </w:r>
+      <w:r>
+        <w:t xml:space="preserve"> launch argument selected the joint-state source (both values were launched).</w:t>
       </w:r>
     </w:p>
     <w:p>
@@ -12925,7 +13038,17 @@
         <w:t>Reproducible builds.</w:t>
       </w:r>
       <w:r>
-        <w:t xml:space="preserve"> Declared dependencies, colcon and rosdep allowed the same workspace to be built from source in a clean container [36].</w:t>
+        <w:t xml:space="preserve"> Declared dependencies and colcon allowed the workspace to be built from source in a fresh container, and </w:t>
+      </w:r>
+      <w:r>
+        <w:rPr>
+          <w:rFonts w:ascii="Courier New" w:hAnsi="Courier New" w:cs="Courier New" w:eastAsia="Courier New"/>
+          <w:sz w:val="21"/>
+        </w:rPr>
+        <w:t>rosdep check</w:t>
+      </w:r>
+      <w:r>
+        <w:t xml:space="preserve"> found every declared dependency except the optional Gazebo keys [36].</w:t>
       </w:r>
     </w:p>
     <w:p>
@@ -13127,7 +13250,7 @@
               <w:rPr>
                 <w:sz w:val="18"/>
               </w:rPr>
-              <w:t>ROS 2 Humble and tools installed; development environment configured; workspace and both example packages created; Python and C++ publishers and subscribers built and run; topic inspection; both cross-language directions; description package and complete URDF/Xacro model visualised in RViz with urdf_tutorial; conceptual study of ROS 2 architecture, communication, packages, RViz and parameters; Python parameter lab started (code listing only). Sources: notes 1.1–1.5 [1]–[5].</w:t>
+              <w:t>Installation and environment set-up; workspace and example packages; Python and C++ publishers and subscribers built and run in both cross-language directions; description package and complete URDF/Xacro model visualised in RViz with urdf_tutorial; conceptual study; Python parameter lab started (file creation and code listing only) [1]–[5].</w:t>
             </w:r>
           </w:p>
         </w:tc>
@@ -13494,7 +13617,7 @@
       </w:pPr>
       <w:r>
         <w:rPr>
-          <w:sz w:val="18"/>
+          <w:sz w:val="17"/>
         </w:rPr>
         <w:t>[1]</w:t>
         <w:tab/>
@@ -13503,13 +13626,13 @@
       <w:r>
         <w:rPr>
           <w:i/>
-          <w:sz w:val="18"/>
+          <w:sz w:val="17"/>
         </w:rPr>
         <w:t>Robotics and ROS 2 – Learn by Doing! Manipulators</w:t>
       </w:r>
       <w:r>
         <w:rPr>
-          <w:sz w:val="18"/>
+          <w:sz w:val="17"/>
         </w:rPr>
         <w:t>, lessons 1, 4–6, Microsoft Word 97-2003 document, last saved 4 Jun. 2026 (file metadata), unpublished.</w:t>
       </w:r>
@@ -13522,7 +13645,7 @@
       </w:pPr>
       <w:r>
         <w:rPr>
-          <w:sz w:val="18"/>
+          <w:sz w:val="17"/>
         </w:rPr>
         <w:t>[2]</w:t>
         <w:tab/>
@@ -13537,7 +13660,7 @@
       </w:pPr>
       <w:r>
         <w:rPr>
-          <w:sz w:val="18"/>
+          <w:sz w:val="17"/>
         </w:rPr>
         <w:t>[3]</w:t>
         <w:tab/>
@@ -13552,7 +13675,7 @@
       </w:pPr>
       <w:r>
         <w:rPr>
-          <w:sz w:val="18"/>
+          <w:sz w:val="17"/>
         </w:rPr>
         <w:t>[4]</w:t>
         <w:tab/>
@@ -13567,7 +13690,7 @@
       </w:pPr>
       <w:r>
         <w:rPr>
-          <w:sz w:val="18"/>
+          <w:sz w:val="17"/>
         </w:rPr>
         <w:t>[5]</w:t>
         <w:tab/>
@@ -13582,7 +13705,7 @@
       </w:pPr>
       <w:r>
         <w:rPr>
-          <w:sz w:val="18"/>
+          <w:sz w:val="17"/>
         </w:rPr>
         <w:t>[6]</w:t>
         <w:tab/>
@@ -13597,7 +13720,7 @@
       </w:pPr>
       <w:r>
         <w:rPr>
-          <w:sz w:val="18"/>
+          <w:sz w:val="17"/>
         </w:rPr>
         <w:t>[7]</w:t>
         <w:tab/>
@@ -13606,13 +13729,13 @@
       <w:r>
         <w:rPr>
           <w:i/>
-          <w:sz w:val="18"/>
+          <w:sz w:val="17"/>
         </w:rPr>
         <w:t>ROS 2 Documentation: Humble</w:t>
       </w:r>
       <w:r>
         <w:rPr>
-          <w:sz w:val="18"/>
+          <w:sz w:val="17"/>
         </w:rPr>
         <w:t>. [Online]. Available: https://docs.ros.org/en/humble/Installation/Ubuntu-Install-Debs.html</w:t>
       </w:r>
@@ -13625,7 +13748,7 @@
       </w:pPr>
       <w:r>
         <w:rPr>
-          <w:sz w:val="18"/>
+          <w:sz w:val="17"/>
         </w:rPr>
         <w:t>[8]</w:t>
         <w:tab/>
@@ -13634,13 +13757,13 @@
       <w:r>
         <w:rPr>
           <w:i/>
-          <w:sz w:val="18"/>
+          <w:sz w:val="17"/>
         </w:rPr>
         <w:t>ROS 2 Documentation: Humble</w:t>
       </w:r>
       <w:r>
         <w:rPr>
-          <w:sz w:val="18"/>
+          <w:sz w:val="17"/>
         </w:rPr>
         <w:t>. [Online]. Available: https://docs.ros.org/en/humble/Releases/Release-Humble-Hawksbill.html</w:t>
       </w:r>
@@ -13653,7 +13776,7 @@
       </w:pPr>
       <w:r>
         <w:rPr>
-          <w:sz w:val="18"/>
+          <w:sz w:val="17"/>
         </w:rPr>
         <w:t>[9]</w:t>
         <w:tab/>
@@ -13662,39 +13785,39 @@
       <w:r>
         <w:rPr>
           <w:rFonts w:ascii="Courier New" w:hAnsi="Courier New" w:cs="Courier New" w:eastAsia="Courier New"/>
-          <w:sz w:val="15"/>
+          <w:sz w:val="14"/>
         </w:rPr>
         <w:t>arduinobot_ws</w:t>
       </w:r>
       <w:r>
         <w:rPr>
-          <w:sz w:val="18"/>
+          <w:sz w:val="17"/>
         </w:rPr>
         <w:t xml:space="preserve">, </w:t>
       </w:r>
       <w:r>
         <w:rPr>
           <w:rFonts w:ascii="Courier New" w:hAnsi="Courier New" w:cs="Courier New" w:eastAsia="Courier New"/>
-          <w:sz w:val="15"/>
+          <w:sz w:val="14"/>
         </w:rPr>
         <w:t>docs/</w:t>
       </w:r>
       <w:r>
         <w:rPr>
-          <w:sz w:val="18"/>
+          <w:sz w:val="17"/>
         </w:rPr>
         <w:t xml:space="preserve"> (provenance, course-progress evidence, repository audit, verification) and </w:t>
       </w:r>
       <w:r>
         <w:rPr>
           <w:rFonts w:ascii="Courier New" w:hAnsi="Courier New" w:cs="Courier New" w:eastAsia="Courier New"/>
-          <w:sz w:val="15"/>
+          <w:sz w:val="14"/>
         </w:rPr>
         <w:t>verification/logs/run_2026-09-28</w:t>
       </w:r>
       <w:r>
         <w:rPr>
-          <w:sz w:val="18"/>
+          <w:sz w:val="17"/>
         </w:rPr>
         <w:t>, delivered with this report.</w:t>
       </w:r>
@@ -13707,7 +13830,7 @@
       </w:pPr>
       <w:r>
         <w:rPr>
-          <w:sz w:val="18"/>
+          <w:sz w:val="17"/>
         </w:rPr>
         <w:t>[10]</w:t>
         <w:tab/>
@@ -13716,13 +13839,13 @@
       <w:r>
         <w:rPr>
           <w:i/>
-          <w:sz w:val="18"/>
+          <w:sz w:val="17"/>
         </w:rPr>
         <w:t>ROS 2 Documentation: Humble</w:t>
       </w:r>
       <w:r>
         <w:rPr>
-          <w:sz w:val="18"/>
+          <w:sz w:val="17"/>
         </w:rPr>
         <w:t>. [Online]. Available: https://docs.ros.org/en/humble/index.html</w:t>
       </w:r>
@@ -13735,7 +13858,7 @@
       </w:pPr>
       <w:r>
         <w:rPr>
-          <w:sz w:val="18"/>
+          <w:sz w:val="17"/>
         </w:rPr>
         <w:t>[11]</w:t>
         <w:tab/>
@@ -13744,13 +13867,13 @@
       <w:r>
         <w:rPr>
           <w:i/>
-          <w:sz w:val="18"/>
+          <w:sz w:val="17"/>
         </w:rPr>
         <w:t>ROS 2 Documentation: Humble</w:t>
       </w:r>
       <w:r>
         <w:rPr>
-          <w:sz w:val="18"/>
+          <w:sz w:val="17"/>
         </w:rPr>
         <w:t>. [Online]. Available: https://docs.ros.org/en/humble/About-ROS.html</w:t>
       </w:r>
@@ -13763,7 +13886,7 @@
       </w:pPr>
       <w:r>
         <w:rPr>
-          <w:sz w:val="18"/>
+          <w:sz w:val="17"/>
         </w:rPr>
         <w:t>[12]</w:t>
         <w:tab/>
@@ -13772,13 +13895,13 @@
       <w:r>
         <w:rPr>
           <w:i/>
-          <w:sz w:val="18"/>
+          <w:sz w:val="17"/>
         </w:rPr>
         <w:t>ROS 2 Documentation: Humble</w:t>
       </w:r>
       <w:r>
         <w:rPr>
-          <w:sz w:val="18"/>
+          <w:sz w:val="17"/>
         </w:rPr>
         <w:t>. [Online]. Available: https://docs.ros.org/en/humble/Tutorials/Beginner-CLI-Tools/Understanding-ROS2-Nodes/Understanding-ROS2-Nodes.html</w:t>
       </w:r>
@@ -13791,7 +13914,7 @@
       </w:pPr>
       <w:r>
         <w:rPr>
-          <w:sz w:val="18"/>
+          <w:sz w:val="17"/>
         </w:rPr>
         <w:t>[13]</w:t>
         <w:tab/>
@@ -13800,13 +13923,13 @@
       <w:r>
         <w:rPr>
           <w:i/>
-          <w:sz w:val="18"/>
+          <w:sz w:val="17"/>
         </w:rPr>
         <w:t>ROS 2 Documentation: Humble</w:t>
       </w:r>
       <w:r>
         <w:rPr>
-          <w:sz w:val="18"/>
+          <w:sz w:val="17"/>
         </w:rPr>
         <w:t>. [Online]. Available: https://docs.ros.org/en/humble/Concepts/Basic/About-Nodes.html</w:t>
       </w:r>
@@ -13819,7 +13942,7 @@
       </w:pPr>
       <w:r>
         <w:rPr>
-          <w:sz w:val="18"/>
+          <w:sz w:val="17"/>
         </w:rPr>
         <w:t>[14]</w:t>
         <w:tab/>
@@ -13828,13 +13951,13 @@
       <w:r>
         <w:rPr>
           <w:i/>
-          <w:sz w:val="18"/>
+          <w:sz w:val="17"/>
         </w:rPr>
         <w:t>ROS 2 Documentation: Humble</w:t>
       </w:r>
       <w:r>
         <w:rPr>
-          <w:sz w:val="18"/>
+          <w:sz w:val="17"/>
         </w:rPr>
         <w:t>. [Online]. Available: https://docs.ros.org/en/humble/Concepts/Basic/About-Discovery.html</w:t>
       </w:r>
@@ -13847,7 +13970,7 @@
       </w:pPr>
       <w:r>
         <w:rPr>
-          <w:sz w:val="18"/>
+          <w:sz w:val="17"/>
         </w:rPr>
         <w:t>[15]</w:t>
         <w:tab/>
@@ -13856,13 +13979,13 @@
       <w:r>
         <w:rPr>
           <w:i/>
-          <w:sz w:val="18"/>
+          <w:sz w:val="17"/>
         </w:rPr>
         <w:t>ROS 2 Documentation: Humble</w:t>
       </w:r>
       <w:r>
         <w:rPr>
-          <w:sz w:val="18"/>
+          <w:sz w:val="17"/>
         </w:rPr>
         <w:t>. [Online]. Available: https://docs.ros.org/en/humble/Releases.html</w:t>
       </w:r>
@@ -13875,7 +13998,7 @@
       </w:pPr>
       <w:r>
         <w:rPr>
-          <w:sz w:val="18"/>
+          <w:sz w:val="17"/>
         </w:rPr>
         <w:t>[16]</w:t>
         <w:tab/>
@@ -13884,13 +14007,13 @@
       <w:r>
         <w:rPr>
           <w:i/>
-          <w:sz w:val="18"/>
+          <w:sz w:val="17"/>
         </w:rPr>
         <w:t>ROS 2 Documentation: Humble</w:t>
       </w:r>
       <w:r>
         <w:rPr>
-          <w:sz w:val="18"/>
+          <w:sz w:val="17"/>
         </w:rPr>
         <w:t>. [Online]. Available: https://docs.ros.org/en/humble/Concepts/Intermediate/About-Different-Middleware-Vendors.html</w:t>
       </w:r>
@@ -13903,7 +14026,7 @@
       </w:pPr>
       <w:r>
         <w:rPr>
-          <w:sz w:val="18"/>
+          <w:sz w:val="17"/>
         </w:rPr>
         <w:t>[17]</w:t>
         <w:tab/>
@@ -13912,13 +14035,13 @@
       <w:r>
         <w:rPr>
           <w:i/>
-          <w:sz w:val="18"/>
+          <w:sz w:val="17"/>
         </w:rPr>
         <w:t>ROS 2 Documentation: Humble</w:t>
       </w:r>
       <w:r>
         <w:rPr>
-          <w:sz w:val="18"/>
+          <w:sz w:val="17"/>
         </w:rPr>
         <w:t>. [Online]. Available: https://docs.ros.org/en/humble/Concepts/Intermediate/About-Quality-of-Service-Settings.html</w:t>
       </w:r>
@@ -13931,7 +14054,7 @@
       </w:pPr>
       <w:r>
         <w:rPr>
-          <w:sz w:val="18"/>
+          <w:sz w:val="17"/>
         </w:rPr>
         <w:t>[18]</w:t>
         <w:tab/>
@@ -13940,13 +14063,13 @@
       <w:r>
         <w:rPr>
           <w:i/>
-          <w:sz w:val="18"/>
+          <w:sz w:val="17"/>
         </w:rPr>
         <w:t>ROS 2 Documentation: Humble</w:t>
       </w:r>
       <w:r>
         <w:rPr>
-          <w:sz w:val="18"/>
+          <w:sz w:val="17"/>
         </w:rPr>
         <w:t>. [Online]. Available: https://docs.ros.org/en/humble/Concepts/Intermediate/About-Domain-ID.html</w:t>
       </w:r>
@@ -13959,7 +14082,7 @@
       </w:pPr>
       <w:r>
         <w:rPr>
-          <w:sz w:val="18"/>
+          <w:sz w:val="17"/>
         </w:rPr>
         <w:t>[19]</w:t>
         <w:tab/>
@@ -13968,13 +14091,13 @@
       <w:r>
         <w:rPr>
           <w:i/>
-          <w:sz w:val="18"/>
+          <w:sz w:val="17"/>
         </w:rPr>
         <w:t>ROS 2 Documentation: Humble</w:t>
       </w:r>
       <w:r>
         <w:rPr>
-          <w:sz w:val="18"/>
+          <w:sz w:val="17"/>
         </w:rPr>
         <w:t>. [Online]. Available: https://docs.ros.org/en/humble/Concepts/Intermediate/About-Security.html</w:t>
       </w:r>
@@ -13987,7 +14110,7 @@
       </w:pPr>
       <w:r>
         <w:rPr>
-          <w:sz w:val="18"/>
+          <w:sz w:val="17"/>
         </w:rPr>
         <w:t>[20]</w:t>
         <w:tab/>
@@ -13996,13 +14119,13 @@
       <w:r>
         <w:rPr>
           <w:i/>
-          <w:sz w:val="18"/>
+          <w:sz w:val="17"/>
         </w:rPr>
         <w:t>ROS 2 Documentation: Humble</w:t>
       </w:r>
       <w:r>
         <w:rPr>
-          <w:sz w:val="18"/>
+          <w:sz w:val="17"/>
         </w:rPr>
         <w:t>. [Online]. Available: https://docs.ros.org/en/humble/Tutorials/Demos/Real-Time-Programming.html</w:t>
       </w:r>
@@ -14015,7 +14138,7 @@
       </w:pPr>
       <w:r>
         <w:rPr>
-          <w:sz w:val="18"/>
+          <w:sz w:val="17"/>
         </w:rPr>
         <w:t>[21]</w:t>
         <w:tab/>
@@ -14024,13 +14147,13 @@
       <w:r>
         <w:rPr>
           <w:i/>
-          <w:sz w:val="18"/>
+          <w:sz w:val="17"/>
         </w:rPr>
         <w:t>ROS 2 Documentation: Humble</w:t>
       </w:r>
       <w:r>
         <w:rPr>
-          <w:sz w:val="18"/>
+          <w:sz w:val="17"/>
         </w:rPr>
         <w:t>. [Online]. Available: https://docs.ros.org/en/humble/Concepts/Intermediate/About-Executors.html</w:t>
       </w:r>
@@ -14043,7 +14166,7 @@
       </w:pPr>
       <w:r>
         <w:rPr>
-          <w:sz w:val="18"/>
+          <w:sz w:val="17"/>
         </w:rPr>
         <w:t>[22]</w:t>
         <w:tab/>
@@ -14052,13 +14175,13 @@
       <w:r>
         <w:rPr>
           <w:i/>
-          <w:sz w:val="18"/>
+          <w:sz w:val="17"/>
         </w:rPr>
         <w:t>ROS 2 Documentation: Humble</w:t>
       </w:r>
       <w:r>
         <w:rPr>
-          <w:sz w:val="18"/>
+          <w:sz w:val="17"/>
         </w:rPr>
         <w:t>. [Online]. Available: https://docs.ros.org/en/humble/Concepts/Basic/About-Client-Libraries.html</w:t>
       </w:r>
@@ -14071,7 +14194,7 @@
       </w:pPr>
       <w:r>
         <w:rPr>
-          <w:sz w:val="18"/>
+          <w:sz w:val="17"/>
         </w:rPr>
         <w:t>[23]</w:t>
         <w:tab/>
@@ -14080,13 +14203,13 @@
       <w:r>
         <w:rPr>
           <w:i/>
-          <w:sz w:val="18"/>
+          <w:sz w:val="17"/>
         </w:rPr>
         <w:t>ROS 2 Documentation: Humble</w:t>
       </w:r>
       <w:r>
         <w:rPr>
-          <w:sz w:val="18"/>
+          <w:sz w:val="17"/>
         </w:rPr>
         <w:t>. [Online]. Available: https://docs.ros.org/en/humble/Concepts/Advanced/About-Internal-Interfaces.html</w:t>
       </w:r>
@@ -14099,7 +14222,7 @@
       </w:pPr>
       <w:r>
         <w:rPr>
-          <w:sz w:val="18"/>
+          <w:sz w:val="17"/>
         </w:rPr>
         <w:t>[24]</w:t>
         <w:tab/>
@@ -14108,13 +14231,13 @@
       <w:r>
         <w:rPr>
           <w:i/>
-          <w:sz w:val="18"/>
+          <w:sz w:val="17"/>
         </w:rPr>
         <w:t>ROS 2 Documentation: Humble</w:t>
       </w:r>
       <w:r>
         <w:rPr>
-          <w:sz w:val="18"/>
+          <w:sz w:val="17"/>
         </w:rPr>
         <w:t>. [Online]. Available: https://docs.ros.org/en/humble/Concepts/Basic/About-Topics.html</w:t>
       </w:r>
@@ -14127,7 +14250,7 @@
       </w:pPr>
       <w:r>
         <w:rPr>
-          <w:sz w:val="18"/>
+          <w:sz w:val="17"/>
         </w:rPr>
         <w:t>[25]</w:t>
         <w:tab/>
@@ -14136,13 +14259,13 @@
       <w:r>
         <w:rPr>
           <w:i/>
-          <w:sz w:val="18"/>
+          <w:sz w:val="17"/>
         </w:rPr>
         <w:t>ROS 2 Documentation: Humble</w:t>
       </w:r>
       <w:r>
         <w:rPr>
-          <w:sz w:val="18"/>
+          <w:sz w:val="17"/>
         </w:rPr>
         <w:t>. [Online]. Available: https://docs.ros.org/en/humble/Concepts/Basic/About-Services.html</w:t>
       </w:r>
@@ -14155,7 +14278,7 @@
       </w:pPr>
       <w:r>
         <w:rPr>
-          <w:sz w:val="18"/>
+          <w:sz w:val="17"/>
         </w:rPr>
         <w:t>[26]</w:t>
         <w:tab/>
@@ -14164,13 +14287,13 @@
       <w:r>
         <w:rPr>
           <w:i/>
-          <w:sz w:val="18"/>
+          <w:sz w:val="17"/>
         </w:rPr>
         <w:t>ROS 2 Documentation: Humble</w:t>
       </w:r>
       <w:r>
         <w:rPr>
-          <w:sz w:val="18"/>
+          <w:sz w:val="17"/>
         </w:rPr>
         <w:t>. [Online]. Available: https://docs.ros.org/en/humble/Concepts/Basic/About-Actions.html</w:t>
       </w:r>
@@ -14183,7 +14306,7 @@
       </w:pPr>
       <w:r>
         <w:rPr>
-          <w:sz w:val="18"/>
+          <w:sz w:val="17"/>
         </w:rPr>
         <w:t>[27]</w:t>
         <w:tab/>
@@ -14192,13 +14315,13 @@
       <w:r>
         <w:rPr>
           <w:i/>
-          <w:sz w:val="18"/>
+          <w:sz w:val="17"/>
         </w:rPr>
         <w:t>ROS 2 Documentation: Humble</w:t>
       </w:r>
       <w:r>
         <w:rPr>
-          <w:sz w:val="18"/>
+          <w:sz w:val="17"/>
         </w:rPr>
         <w:t>. [Online]. Available: https://docs.ros.org/en/humble/Concepts/Basic/About-Interfaces.html</w:t>
       </w:r>
@@ -14211,7 +14334,7 @@
       </w:pPr>
       <w:r>
         <w:rPr>
-          <w:sz w:val="18"/>
+          <w:sz w:val="17"/>
         </w:rPr>
         <w:t>[28]</w:t>
         <w:tab/>
@@ -14220,13 +14343,13 @@
       <w:r>
         <w:rPr>
           <w:i/>
-          <w:sz w:val="18"/>
+          <w:sz w:val="17"/>
         </w:rPr>
         <w:t>ROS 2 Documentation: Humble</w:t>
       </w:r>
       <w:r>
         <w:rPr>
-          <w:sz w:val="18"/>
+          <w:sz w:val="17"/>
         </w:rPr>
         <w:t>. [Online]. Available: https://docs.ros.org/en/humble/Tutorials/Beginner-CLI-Tools/Understanding-ROS2-Topics/Understanding-ROS2-Topics.html</w:t>
       </w:r>
@@ -14239,7 +14362,7 @@
       </w:pPr>
       <w:r>
         <w:rPr>
-          <w:sz w:val="18"/>
+          <w:sz w:val="17"/>
         </w:rPr>
         <w:t>[29]</w:t>
         <w:tab/>
@@ -14248,13 +14371,13 @@
       <w:r>
         <w:rPr>
           <w:i/>
-          <w:sz w:val="18"/>
+          <w:sz w:val="17"/>
         </w:rPr>
         <w:t>ROS 2 Documentation: Humble</w:t>
       </w:r>
       <w:r>
         <w:rPr>
-          <w:sz w:val="18"/>
+          <w:sz w:val="17"/>
         </w:rPr>
         <w:t>. [Online]. Available: https://docs.ros.org/en/humble/Tutorials/Beginner-Client-Libraries/Writing-A-Simple-Py-Publisher-And-Subscriber.html</w:t>
       </w:r>
@@ -14267,7 +14390,7 @@
       </w:pPr>
       <w:r>
         <w:rPr>
-          <w:sz w:val="18"/>
+          <w:sz w:val="17"/>
         </w:rPr>
         <w:t>[30]</w:t>
         <w:tab/>
@@ -14276,13 +14399,13 @@
       <w:r>
         <w:rPr>
           <w:i/>
-          <w:sz w:val="18"/>
+          <w:sz w:val="17"/>
         </w:rPr>
         <w:t>ROS 2 Documentation: Humble</w:t>
       </w:r>
       <w:r>
         <w:rPr>
-          <w:sz w:val="18"/>
+          <w:sz w:val="17"/>
         </w:rPr>
         <w:t>. [Online]. Available: https://docs.ros.org/en/humble/Tutorials/Beginner-Client-Libraries/Creating-A-Workspace/Creating-A-Workspace.html</w:t>
       </w:r>
@@ -14295,7 +14418,7 @@
       </w:pPr>
       <w:r>
         <w:rPr>
-          <w:sz w:val="18"/>
+          <w:sz w:val="17"/>
         </w:rPr>
         <w:t>[31]</w:t>
         <w:tab/>
@@ -14304,13 +14427,13 @@
       <w:r>
         <w:rPr>
           <w:i/>
-          <w:sz w:val="18"/>
+          <w:sz w:val="17"/>
         </w:rPr>
         <w:t>ROS 2 Documentation: Humble</w:t>
       </w:r>
       <w:r>
         <w:rPr>
-          <w:sz w:val="18"/>
+          <w:sz w:val="17"/>
         </w:rPr>
         <w:t>. [Online]. Available: https://docs.ros.org/en/humble/Tutorials/Beginner-CLI-Tools/Configuring-ROS2-Environment.html</w:t>
       </w:r>
@@ -14323,7 +14446,7 @@
       </w:pPr>
       <w:r>
         <w:rPr>
-          <w:sz w:val="18"/>
+          <w:sz w:val="17"/>
         </w:rPr>
         <w:t>[32]</w:t>
         <w:tab/>
@@ -14332,13 +14455,13 @@
       <w:r>
         <w:rPr>
           <w:i/>
-          <w:sz w:val="18"/>
+          <w:sz w:val="17"/>
         </w:rPr>
         <w:t>ROS 2 Documentation: Humble</w:t>
       </w:r>
       <w:r>
         <w:rPr>
-          <w:sz w:val="18"/>
+          <w:sz w:val="17"/>
         </w:rPr>
         <w:t>. [Online]. Available: https://docs.ros.org/en/humble/Concepts/Advanced/About-Build-System.html</w:t>
       </w:r>
@@ -14351,7 +14474,7 @@
       </w:pPr>
       <w:r>
         <w:rPr>
-          <w:sz w:val="18"/>
+          <w:sz w:val="17"/>
         </w:rPr>
         <w:t>[33]</w:t>
         <w:tab/>
@@ -14360,13 +14483,13 @@
       <w:r>
         <w:rPr>
           <w:i/>
-          <w:sz w:val="18"/>
+          <w:sz w:val="17"/>
         </w:rPr>
         <w:t>ROS 2 Documentation: Humble</w:t>
       </w:r>
       <w:r>
         <w:rPr>
-          <w:sz w:val="18"/>
+          <w:sz w:val="17"/>
         </w:rPr>
         <w:t>. [Online]. Available: https://docs.ros.org/en/humble/Tutorials/Beginner-Client-Libraries/Colcon-Tutorial.html</w:t>
       </w:r>
@@ -14379,7 +14502,7 @@
       </w:pPr>
       <w:r>
         <w:rPr>
-          <w:sz w:val="18"/>
+          <w:sz w:val="17"/>
         </w:rPr>
         <w:t>[34]</w:t>
         <w:tab/>
@@ -14388,13 +14511,13 @@
       <w:r>
         <w:rPr>
           <w:i/>
-          <w:sz w:val="18"/>
+          <w:sz w:val="17"/>
         </w:rPr>
         <w:t>ROS 2 Documentation: Humble</w:t>
       </w:r>
       <w:r>
         <w:rPr>
-          <w:sz w:val="18"/>
+          <w:sz w:val="17"/>
         </w:rPr>
         <w:t>. [Online]. Available: https://docs.ros.org/en/humble/Tutorials/Beginner-Client-Libraries/Creating-Your-First-ROS2-Package.html</w:t>
       </w:r>
@@ -14407,7 +14530,7 @@
       </w:pPr>
       <w:r>
         <w:rPr>
-          <w:sz w:val="18"/>
+          <w:sz w:val="17"/>
         </w:rPr>
         <w:t>[35]</w:t>
         <w:tab/>
@@ -14416,13 +14539,13 @@
       <w:r>
         <w:rPr>
           <w:i/>
-          <w:sz w:val="18"/>
+          <w:sz w:val="17"/>
         </w:rPr>
         <w:t>ROS 2 Documentation: Humble</w:t>
       </w:r>
       <w:r>
         <w:rPr>
-          <w:sz w:val="18"/>
+          <w:sz w:val="17"/>
         </w:rPr>
         <w:t>. [Online]. Available: https://docs.ros.org/en/humble/Tutorials/Beginner-Client-Libraries/Writing-A-Simple-Cpp-Publisher-And-Subscriber.html</w:t>
       </w:r>
@@ -14435,7 +14558,7 @@
       </w:pPr>
       <w:r>
         <w:rPr>
-          <w:sz w:val="18"/>
+          <w:sz w:val="17"/>
         </w:rPr>
         <w:t>[36]</w:t>
         <w:tab/>
@@ -14444,13 +14567,13 @@
       <w:r>
         <w:rPr>
           <w:i/>
-          <w:sz w:val="18"/>
+          <w:sz w:val="17"/>
         </w:rPr>
         <w:t>ROS 2 Documentation: Humble</w:t>
       </w:r>
       <w:r>
         <w:rPr>
-          <w:sz w:val="18"/>
+          <w:sz w:val="17"/>
         </w:rPr>
         <w:t>. [Online]. Available: https://docs.ros.org/en/humble/Tutorials/Intermediate/Rosdep.html</w:t>
       </w:r>
@@ -14463,7 +14586,7 @@
       </w:pPr>
       <w:r>
         <w:rPr>
-          <w:sz w:val="18"/>
+          <w:sz w:val="17"/>
         </w:rPr>
         <w:t>[37]</w:t>
         <w:tab/>
@@ -14472,13 +14595,13 @@
       <w:r>
         <w:rPr>
           <w:i/>
-          <w:sz w:val="18"/>
+          <w:sz w:val="17"/>
         </w:rPr>
         <w:t>ROS 2 Documentation: Humble</w:t>
       </w:r>
       <w:r>
         <w:rPr>
-          <w:sz w:val="18"/>
+          <w:sz w:val="17"/>
         </w:rPr>
         <w:t>. [Online]. Available: https://docs.ros.org/en/humble/Tutorials/Intermediate/URDF/URDF-Main.html</w:t>
       </w:r>
@@ -14491,7 +14614,7 @@
       </w:pPr>
       <w:r>
         <w:rPr>
-          <w:sz w:val="18"/>
+          <w:sz w:val="17"/>
         </w:rPr>
         <w:t>[38]</w:t>
         <w:tab/>
@@ -14500,13 +14623,13 @@
       <w:r>
         <w:rPr>
           <w:i/>
-          <w:sz w:val="18"/>
+          <w:sz w:val="17"/>
         </w:rPr>
         <w:t>ROS 2 Documentation: Humble</w:t>
       </w:r>
       <w:r>
         <w:rPr>
-          <w:sz w:val="18"/>
+          <w:sz w:val="17"/>
         </w:rPr>
         <w:t>. [Online]. Available: https://docs.ros.org/en/humble/Tutorials/Intermediate/URDF/Building-a-Visual-Robot-Model-with-URDF-from-Scratch.html</w:t>
       </w:r>
@@ -14519,7 +14642,7 @@
       </w:pPr>
       <w:r>
         <w:rPr>
-          <w:sz w:val="18"/>
+          <w:sz w:val="17"/>
         </w:rPr>
         <w:t>[39]</w:t>
         <w:tab/>
@@ -14528,13 +14651,13 @@
       <w:r>
         <w:rPr>
           <w:i/>
-          <w:sz w:val="18"/>
+          <w:sz w:val="17"/>
         </w:rPr>
         <w:t>ROS 2 Documentation: Humble</w:t>
       </w:r>
       <w:r>
         <w:rPr>
-          <w:sz w:val="18"/>
+          <w:sz w:val="17"/>
         </w:rPr>
         <w:t>. [Online]. Available: https://docs.ros.org/en/humble/Tutorials/Intermediate/URDF/Using-Xacro-to-Clean-Up-a-URDF-File.html</w:t>
       </w:r>
@@ -14547,7 +14670,7 @@
       </w:pPr>
       <w:r>
         <w:rPr>
-          <w:sz w:val="18"/>
+          <w:sz w:val="17"/>
         </w:rPr>
         <w:t>[40]</w:t>
         <w:tab/>
@@ -14556,13 +14679,13 @@
       <w:r>
         <w:rPr>
           <w:i/>
-          <w:sz w:val="18"/>
+          <w:sz w:val="17"/>
         </w:rPr>
         <w:t>ROS 2 Documentation: Humble</w:t>
       </w:r>
       <w:r>
         <w:rPr>
-          <w:sz w:val="18"/>
+          <w:sz w:val="17"/>
         </w:rPr>
         <w:t>. [Online]. Available: https://docs.ros.org/en/humble/Tutorials/Intermediate/URDF/Adding-Physical-and-Collision-Properties-to-a-URDF-Model.html</w:t>
       </w:r>
@@ -14575,7 +14698,7 @@
       </w:pPr>
       <w:r>
         <w:rPr>
-          <w:sz w:val="18"/>
+          <w:sz w:val="17"/>
         </w:rPr>
         <w:t>[41]</w:t>
         <w:tab/>
@@ -14584,13 +14707,13 @@
       <w:r>
         <w:rPr>
           <w:i/>
-          <w:sz w:val="18"/>
+          <w:sz w:val="17"/>
         </w:rPr>
         <w:t>ROS 2 Documentation: Humble</w:t>
       </w:r>
       <w:r>
         <w:rPr>
-          <w:sz w:val="18"/>
+          <w:sz w:val="17"/>
         </w:rPr>
         <w:t>. [Online]. Available: https://docs.ros.org/en/humble/Tutorials/Intermediate/URDF/Building-a-Movable-Robot-Model-with-URDF.html</w:t>
       </w:r>
@@ -14603,7 +14726,7 @@
       </w:pPr>
       <w:r>
         <w:rPr>
-          <w:sz w:val="18"/>
+          <w:sz w:val="17"/>
         </w:rPr>
         <w:t>[42]</w:t>
         <w:tab/>
@@ -14612,13 +14735,13 @@
       <w:r>
         <w:rPr>
           <w:i/>
-          <w:sz w:val="18"/>
+          <w:sz w:val="17"/>
         </w:rPr>
         <w:t>ROS 2 Documentation: Humble</w:t>
       </w:r>
       <w:r>
         <w:rPr>
-          <w:sz w:val="18"/>
+          <w:sz w:val="17"/>
         </w:rPr>
         <w:t>. [Online]. Available: https://docs.ros.org/en/humble/Concepts/Intermediate/About-Tf2.html</w:t>
       </w:r>
@@ -14631,7 +14754,7 @@
       </w:pPr>
       <w:r>
         <w:rPr>
-          <w:sz w:val="18"/>
+          <w:sz w:val="17"/>
         </w:rPr>
         <w:t>[43]</w:t>
         <w:tab/>
@@ -14640,13 +14763,13 @@
       <w:r>
         <w:rPr>
           <w:i/>
-          <w:sz w:val="18"/>
+          <w:sz w:val="17"/>
         </w:rPr>
         <w:t>ROS 2 Documentation: Humble</w:t>
       </w:r>
       <w:r>
         <w:rPr>
-          <w:sz w:val="18"/>
+          <w:sz w:val="17"/>
         </w:rPr>
         <w:t>. [Online]. Available: https://docs.ros.org/en/humble/Tutorials/Intermediate/URDF/Using-URDF-with-Robot-State-Publisher-py.html</w:t>
       </w:r>
@@ -14659,7 +14782,7 @@
       </w:pPr>
       <w:r>
         <w:rPr>
-          <w:sz w:val="18"/>
+          <w:sz w:val="17"/>
         </w:rPr>
         <w:t>[44]</w:t>
         <w:tab/>
@@ -14668,13 +14791,13 @@
       <w:r>
         <w:rPr>
           <w:i/>
-          <w:sz w:val="18"/>
+          <w:sz w:val="17"/>
         </w:rPr>
         <w:t>ROS 2 Documentation: Humble</w:t>
       </w:r>
       <w:r>
         <w:rPr>
-          <w:sz w:val="18"/>
+          <w:sz w:val="17"/>
         </w:rPr>
         <w:t>. [Online]. Available: https://docs.ros.org/en/humble/Tutorials/Intermediate/Tf2/Introduction-To-Tf2.html</w:t>
       </w:r>
@@ -14687,7 +14810,7 @@
       </w:pPr>
       <w:r>
         <w:rPr>
-          <w:sz w:val="18"/>
+          <w:sz w:val="17"/>
         </w:rPr>
         <w:t>[45]</w:t>
         <w:tab/>
@@ -14696,13 +14819,13 @@
       <w:r>
         <w:rPr>
           <w:i/>
-          <w:sz w:val="18"/>
+          <w:sz w:val="17"/>
         </w:rPr>
         <w:t>ROS 2 Documentation: Humble</w:t>
       </w:r>
       <w:r>
         <w:rPr>
-          <w:sz w:val="18"/>
+          <w:sz w:val="17"/>
         </w:rPr>
         <w:t>. [Online]. Available: https://docs.ros.org/en/humble/Tutorials/Intermediate/RViz/RViz-User-Guide/RViz-User-Guide.html</w:t>
       </w:r>
@@ -14715,7 +14838,7 @@
       </w:pPr>
       <w:r>
         <w:rPr>
-          <w:sz w:val="18"/>
+          <w:sz w:val="17"/>
         </w:rPr>
         <w:t>[46]</w:t>
         <w:tab/>
@@ -14724,13 +14847,13 @@
       <w:r>
         <w:rPr>
           <w:i/>
-          <w:sz w:val="18"/>
+          <w:sz w:val="17"/>
         </w:rPr>
         <w:t>ROS 2 Documentation: Humble</w:t>
       </w:r>
       <w:r>
         <w:rPr>
-          <w:sz w:val="18"/>
+          <w:sz w:val="17"/>
         </w:rPr>
         <w:t>. [Online]. Available: https://docs.ros.org/en/humble/Concepts/Basic/About-Parameters.html</w:t>
       </w:r>
@@ -14743,7 +14866,7 @@
       </w:pPr>
       <w:r>
         <w:rPr>
-          <w:sz w:val="18"/>
+          <w:sz w:val="17"/>
         </w:rPr>
         <w:t>[47]</w:t>
         <w:tab/>
@@ -14752,13 +14875,13 @@
       <w:r>
         <w:rPr>
           <w:i/>
-          <w:sz w:val="18"/>
+          <w:sz w:val="17"/>
         </w:rPr>
         <w:t>ROS 2 Documentation: Humble</w:t>
       </w:r>
       <w:r>
         <w:rPr>
-          <w:sz w:val="18"/>
+          <w:sz w:val="17"/>
         </w:rPr>
         <w:t>. [Online]. Available: https://docs.ros.org/en/humble/Tutorials/Beginner-CLI-Tools/Understanding-ROS2-Parameters/Understanding-ROS2-Parameters.html</w:t>
       </w:r>
@@ -14771,7 +14894,7 @@
       </w:pPr>
       <w:r>
         <w:rPr>
-          <w:sz w:val="18"/>
+          <w:sz w:val="17"/>
         </w:rPr>
         <w:t>[48]</w:t>
         <w:tab/>

</xml_diff>